<commit_message>
style(plan-trabajo): encabezado del docx con la grilla de la referencia NEXA
Logo | NEXA RESOURCES; datos del proyecto en un bloque de 2 filas con etiqueta
en negrita y valor en la misma linea; N. NEXA | HOJA y N. CONSULTOR | REV.
en filas separadas.

Co-Authored-By: Claude Opus 5.5 <noreply@anthropic.com>
</commit_message>
<xml_diff>
--- a/src/lib/services/planTrabajo/templates/plan-trabajo-nexa-template.docx
+++ b/src/lib/services/planTrabajo/templates/plan-trabajo-nexa-template.docx
@@ -6480,7 +6480,7 @@
 <w:hdr xmlns:wpc="http://schemas.microsoft.com/office/word/2010/wordprocessingCanvas" xmlns:mc="http://schemas.openxmlformats.org/markup-compatibility/2006" xmlns:o="urn:schemas-microsoft-com:office:office" xmlns:r="http://schemas.openxmlformats.org/officeDocument/2006/relationships" xmlns:m="http://schemas.openxmlformats.org/officeDocument/2006/math" xmlns:v="urn:schemas-microsoft-com:vml" xmlns:wp14="http://schemas.microsoft.com/office/word/2010/wordprocessingDrawing" xmlns:wp="http://schemas.openxmlformats.org/drawingml/2006/wordprocessingDrawing" xmlns:w10="urn:schemas-microsoft-com:office:word" xmlns:w="http://schemas.openxmlformats.org/wordprocessingml/2006/main" xmlns:w14="http://schemas.microsoft.com/office/word/2010/wordml" xmlns:w15="http://schemas.microsoft.com/office/word/2012/wordml" xmlns:wpg="http://schemas.microsoft.com/office/word/2010/wordprocessingGroup" xmlns:wpi="http://schemas.microsoft.com/office/word/2010/wordprocessingInk" xmlns:wne="http://schemas.microsoft.com/office/word/2006/wordml" xmlns:wps="http://schemas.microsoft.com/office/word/2010/wordprocessingShape" xmlns:cx="http://schemas.microsoft.com/office/drawing/2014/chartex" xmlns:cx1="http://schemas.microsoft.com/office/drawing/2015/9/8/chartex" xmlns:cx2="http://schemas.microsoft.com/office/drawing/2015/10/21/chartex" xmlns:cx3="http://schemas.microsoft.com/office/drawing/2016/5/9/chartex" xmlns:cx4="http://schemas.microsoft.com/office/drawing/2016/5/10/chartex" xmlns:cx5="http://schemas.microsoft.com/office/drawing/2016/5/11/chartex" xmlns:cx6="http://schemas.microsoft.com/office/drawing/2016/5/12/chartex" xmlns:cx7="http://schemas.microsoft.com/office/drawing/2016/5/13/chartex" xmlns:cx8="http://schemas.microsoft.com/office/drawing/2016/5/14/chartex" xmlns:w16cid="http://schemas.microsoft.com/office/word/2016/wordml/cid" xmlns:w16se="http://schemas.microsoft.com/office/word/2015/wordml/symex">
   <w:tbl>
     <w:tblPr>
-      <w:tblW w:type="dxa" w:w="9640"/>
+      <w:tblW w:w="9640" w:type="dxa"/>
       <w:tblBorders>
         <w:top w:val="single" w:color="auto" w:sz="4"/>
         <w:left w:val="single" w:color="auto" w:sz="4"/>
@@ -6489,27 +6489,28 @@
         <w:insideH w:val="single" w:color="auto" w:sz="4"/>
         <w:insideV w:val="single" w:color="auto" w:sz="4"/>
       </w:tblBorders>
+      <w:tblLayout w:type="fixed"/>
     </w:tblPr>
     <w:tblGrid>
-      <w:gridCol w:w="4200"/>
-      <w:gridCol w:w="3440"/>
-      <w:gridCol w:w="2000"/>
+      <w:gridCol w:w="5315"/>
+      <w:gridCol w:w="3333"/>
+      <w:gridCol w:w="992"/>
     </w:tblGrid>
     <w:tr>
       <w:tc>
         <w:tcPr>
-          <w:tcW w:type="dxa" w:w="4200"/>
+          <w:tcW w:w="5315" w:type="dxa"/>
           <w:tcMar>
-            <w:top w:type="dxa" w:w="40"/>
-            <w:left w:type="dxa" w:w="80"/>
-            <w:bottom w:type="dxa" w:w="40"/>
-            <w:right w:type="dxa" w:w="80"/>
+            <w:top w:w="30" w:type="dxa"/>
+            <w:left w:w="80" w:type="dxa"/>
+            <w:bottom w:w="30" w:type="dxa"/>
+            <w:right w:w="80" w:type="dxa"/>
           </w:tcMar>
           <w:vAlign w:val="center"/>
         </w:tcPr>
         <w:p>
           <w:pPr>
-            <w:spacing w:after="120" w:before="0"/>
+            <w:spacing w:before="60" w:after="60"/>
             <w:jc w:val="center"/>
           </w:pPr>
           <w:r>
@@ -6553,19 +6554,19 @@
       </w:tc>
       <w:tc>
         <w:tcPr>
-          <w:tcW w:type="dxa" w:w="5440"/>
+          <w:tcW w:w="4325" w:type="dxa"/>
           <w:gridSpan w:val="2"/>
           <w:tcMar>
-            <w:top w:type="dxa" w:w="40"/>
-            <w:left w:type="dxa" w:w="80"/>
-            <w:bottom w:type="dxa" w:w="40"/>
-            <w:right w:type="dxa" w:w="80"/>
+            <w:top w:w="30" w:type="dxa"/>
+            <w:left w:w="80" w:type="dxa"/>
+            <w:bottom w:w="30" w:type="dxa"/>
+            <w:right w:w="80" w:type="dxa"/>
           </w:tcMar>
           <w:vAlign w:val="center"/>
         </w:tcPr>
         <w:p>
           <w:pPr>
-            <w:spacing w:after="0" w:before="0"/>
+            <w:spacing w:before="0" w:after="0"/>
             <w:jc w:val="center"/>
           </w:pPr>
           <w:r>
@@ -6573,17 +6574,15 @@
               <w:rFonts w:ascii="Arial Narrow" w:cs="Arial Narrow" w:eastAsia="Arial Narrow" w:hAnsi="Arial Narrow"/>
               <w:b/>
               <w:bCs/>
-              <w:i w:val="false"/>
-              <w:iCs w:val="false"/>
-              <w:sz w:val="22"/>
-              <w:szCs w:val="22"/>
+              <w:sz w:val="20"/>
+              <w:szCs w:val="20"/>
             </w:rPr>
             <w:t xml:space="preserve">NEXA RESOURCES</w:t>
           </w:r>
         </w:p>
         <w:p>
           <w:pPr>
-            <w:spacing w:after="0" w:before="0"/>
+            <w:spacing w:before="0" w:after="0"/>
             <w:jc w:val="center"/>
           </w:pPr>
           <w:r>
@@ -6591,10 +6590,8 @@
               <w:rFonts w:ascii="Arial Narrow" w:cs="Arial Narrow" w:eastAsia="Arial Narrow" w:hAnsi="Arial Narrow"/>
               <w:b/>
               <w:bCs/>
-              <w:i w:val="false"/>
-              <w:iCs w:val="false"/>
-              <w:sz w:val="22"/>
-              <w:szCs w:val="22"/>
+              <w:sz w:val="20"/>
+              <w:szCs w:val="20"/>
             </w:rPr>
             <w:t xml:space="preserve">REFINERIA CAJAMARQUILLA</w:t>
           </w:r>
@@ -6604,108 +6601,85 @@
     <w:tr>
       <w:tc>
         <w:tcPr>
-          <w:tcW w:type="dxa" w:w="4200"/>
+          <w:tcW w:w="5315" w:type="dxa"/>
+          <w:vMerge w:val="restart"/>
           <w:tcMar>
-            <w:top w:type="dxa" w:w="40"/>
-            <w:left w:type="dxa" w:w="80"/>
-            <w:bottom w:type="dxa" w:w="40"/>
-            <w:right w:type="dxa" w:w="80"/>
+            <w:top w:w="30" w:type="dxa"/>
+            <w:left w:w="80" w:type="dxa"/>
+            <w:bottom w:w="30" w:type="dxa"/>
+            <w:right w:w="80" w:type="dxa"/>
           </w:tcMar>
-          <w:vAlign w:val="center"/>
         </w:tcPr>
         <w:p>
           <w:pPr>
-            <w:spacing w:after="0" w:before="0"/>
+            <w:spacing w:before="0" w:after="0"/>
           </w:pPr>
           <w:r>
             <w:rPr>
               <w:rFonts w:ascii="Arial Narrow" w:cs="Arial Narrow" w:eastAsia="Arial Narrow" w:hAnsi="Arial Narrow"/>
               <w:b/>
               <w:bCs/>
-              <w:i w:val="false"/>
-              <w:iCs w:val="false"/>
-              <w:sz w:val="22"/>
-              <w:szCs w:val="22"/>
+              <w:sz w:val="20"/>
+              <w:szCs w:val="20"/>
             </w:rPr>
             <w:t xml:space="preserve">ORDEN DE COMPRA </w:t>
           </w:r>
           <w:r>
             <w:rPr>
               <w:rFonts w:ascii="Arial Narrow" w:cs="Arial Narrow" w:eastAsia="Arial Narrow" w:hAnsi="Arial Narrow"/>
-              <w:b w:val="false"/>
-              <w:bCs w:val="false"/>
-              <w:i w:val="false"/>
-              <w:iCs w:val="false"/>
-              <w:sz w:val="22"/>
-              <w:szCs w:val="22"/>
+              <w:sz w:val="20"/>
+              <w:szCs w:val="20"/>
             </w:rPr>
             <w:t xml:space="preserve">{ordenCompra}</w:t>
           </w:r>
         </w:p>
         <w:p>
           <w:pPr>
-            <w:spacing w:after="0" w:before="0"/>
+            <w:spacing w:before="0" w:after="0"/>
           </w:pPr>
           <w:r>
             <w:rPr>
               <w:rFonts w:ascii="Arial Narrow" w:cs="Arial Narrow" w:eastAsia="Arial Narrow" w:hAnsi="Arial Narrow"/>
               <w:b/>
               <w:bCs/>
-              <w:i w:val="false"/>
-              <w:iCs w:val="false"/>
-              <w:sz w:val="22"/>
-              <w:szCs w:val="22"/>
+              <w:sz w:val="20"/>
+              <w:szCs w:val="20"/>
             </w:rPr>
-            <w:t xml:space="preserve">NOMBRE DEL PROYECTO</w:t>
+            <w:t xml:space="preserve">NOMBRE DEL PROYECTO </w:t>
           </w:r>
-        </w:p>
-        <w:p>
-          <w:pPr>
-            <w:spacing w:after="0" w:before="0"/>
-          </w:pPr>
           <w:r>
             <w:rPr>
               <w:rFonts w:ascii="Arial Narrow" w:cs="Arial Narrow" w:eastAsia="Arial Narrow" w:hAnsi="Arial Narrow"/>
-              <w:b w:val="false"/>
-              <w:bCs w:val="false"/>
-              <w:i w:val="false"/>
-              <w:iCs w:val="false"/>
-              <w:sz w:val="22"/>
-              <w:szCs w:val="22"/>
+              <w:sz w:val="20"/>
+              <w:szCs w:val="20"/>
             </w:rPr>
             <w:t xml:space="preserve">{nombreProyecto}</w:t>
           </w:r>
         </w:p>
         <w:p>
           <w:pPr>
-            <w:spacing w:after="0" w:before="0"/>
+            <w:spacing w:before="0" w:after="0"/>
           </w:pPr>
           <w:r>
             <w:rPr>
               <w:rFonts w:ascii="Arial Narrow" w:cs="Arial Narrow" w:eastAsia="Arial Narrow" w:hAnsi="Arial Narrow"/>
               <w:b/>
               <w:bCs/>
-              <w:i w:val="false"/>
-              <w:iCs w:val="false"/>
-              <w:sz w:val="22"/>
-              <w:szCs w:val="22"/>
+              <w:sz w:val="20"/>
+              <w:szCs w:val="20"/>
             </w:rPr>
             <w:t xml:space="preserve">TIPO DE DOCUMENTO/TÍTULO DEL DOCUMENTO</w:t>
           </w:r>
         </w:p>
         <w:p>
           <w:pPr>
-            <w:spacing w:after="0" w:before="0"/>
+            <w:spacing w:before="0" w:after="0"/>
           </w:pPr>
           <w:r>
             <w:rPr>
               <w:rFonts w:ascii="Arial Narrow" w:cs="Arial Narrow" w:eastAsia="Arial Narrow" w:hAnsi="Arial Narrow"/>
-              <w:b w:val="false"/>
-              <w:bCs w:val="false"/>
-              <w:i w:val="false"/>
-              <w:iCs w:val="false"/>
-              <w:sz w:val="22"/>
-              <w:szCs w:val="22"/>
+              <w:sz w:val="20"/>
+              <w:szCs w:val="20"/>
             </w:rPr>
             <w:t xml:space="preserve">PLAN DE TRABAJO</w:t>
           </w:r>
@@ -6713,18 +6687,57 @@
       </w:tc>
       <w:tc>
         <w:tcPr>
-          <w:tcW w:type="dxa" w:w="3440"/>
+          <w:tcW w:w="3333" w:type="dxa"/>
           <w:tcMar>
-            <w:top w:type="dxa" w:w="40"/>
-            <w:left w:type="dxa" w:w="80"/>
-            <w:bottom w:type="dxa" w:w="40"/>
-            <w:right w:type="dxa" w:w="80"/>
+            <w:top w:w="30" w:type="dxa"/>
+            <w:left w:w="80" w:type="dxa"/>
+            <w:bottom w:w="30" w:type="dxa"/>
+            <w:right w:w="80" w:type="dxa"/>
           </w:tcMar>
-          <w:vAlign w:val="center"/>
         </w:tcPr>
         <w:p>
           <w:pPr>
-            <w:spacing w:after="0" w:before="0"/>
+            <w:spacing w:before="0" w:after="0"/>
+          </w:pPr>
+          <w:r>
+            <w:rPr>
+              <w:rFonts w:ascii="Arial Narrow" w:cs="Arial Narrow" w:eastAsia="Arial Narrow" w:hAnsi="Arial Narrow"/>
+              <w:b/>
+              <w:bCs/>
+              <w:sz w:val="20"/>
+              <w:szCs w:val="20"/>
+            </w:rPr>
+            <w:t xml:space="preserve">Nº. NEXA:</w:t>
+          </w:r>
+        </w:p>
+        <w:p>
+          <w:pPr>
+            <w:spacing w:before="0" w:after="0"/>
+            <w:jc w:val="center"/>
+          </w:pPr>
+          <w:r>
+            <w:rPr>
+              <w:rFonts w:ascii="Arial Narrow" w:cs="Arial Narrow" w:eastAsia="Arial Narrow" w:hAnsi="Arial Narrow"/>
+              <w:sz w:val="20"/>
+              <w:szCs w:val="20"/>
+            </w:rPr>
+            <w:t xml:space="preserve">{codigoDocumento}</w:t>
+          </w:r>
+        </w:p>
+      </w:tc>
+      <w:tc>
+        <w:tcPr>
+          <w:tcW w:w="992" w:type="dxa"/>
+          <w:tcMar>
+            <w:top w:w="30" w:type="dxa"/>
+            <w:left w:w="80" w:type="dxa"/>
+            <w:bottom w:w="30" w:type="dxa"/>
+            <w:right w:w="80" w:type="dxa"/>
+          </w:tcMar>
+        </w:tcPr>
+        <w:p>
+          <w:pPr>
+            <w:spacing w:before="0" w:after="0"/>
             <w:jc w:val="center"/>
           </w:pPr>
           <w:r>
@@ -6732,108 +6745,22 @@
               <w:rFonts w:ascii="Arial Narrow" w:cs="Arial Narrow" w:eastAsia="Arial Narrow" w:hAnsi="Arial Narrow"/>
               <w:b/>
               <w:bCs/>
-              <w:i w:val="false"/>
-              <w:iCs w:val="false"/>
-              <w:sz w:val="22"/>
-              <w:szCs w:val="22"/>
-            </w:rPr>
-            <w:t xml:space="preserve">Nº. NEXA:</w:t>
-          </w:r>
-        </w:p>
-        <w:p>
-          <w:pPr>
-            <w:spacing w:after="0" w:before="0"/>
-            <w:jc w:val="center"/>
-          </w:pPr>
-          <w:r>
-            <w:rPr>
-              <w:rFonts w:ascii="Arial Narrow" w:cs="Arial Narrow" w:eastAsia="Arial Narrow" w:hAnsi="Arial Narrow"/>
-              <w:b w:val="false"/>
-              <w:bCs w:val="false"/>
-              <w:i w:val="false"/>
-              <w:iCs w:val="false"/>
-              <w:sz w:val="22"/>
-              <w:szCs w:val="22"/>
-            </w:rPr>
-            <w:t xml:space="preserve">{codigoDocumento}</w:t>
-          </w:r>
-        </w:p>
-        <w:p>
-          <w:pPr>
-            <w:spacing w:after="0" w:before="0"/>
-            <w:jc w:val="center"/>
-          </w:pPr>
-          <w:r>
-            <w:rPr>
-              <w:rFonts w:ascii="Arial Narrow" w:cs="Arial Narrow" w:eastAsia="Arial Narrow" w:hAnsi="Arial Narrow"/>
-              <w:b/>
-              <w:bCs/>
-              <w:i w:val="false"/>
-              <w:iCs w:val="false"/>
-              <w:sz w:val="22"/>
-              <w:szCs w:val="22"/>
-            </w:rPr>
-            <w:t xml:space="preserve">Nº. CONSULTOR:</w:t>
-          </w:r>
-        </w:p>
-        <w:p>
-          <w:pPr>
-            <w:spacing w:after="0" w:before="0"/>
-            <w:jc w:val="center"/>
-          </w:pPr>
-          <w:r>
-            <w:rPr>
-              <w:rFonts w:ascii="Arial Narrow" w:cs="Arial Narrow" w:eastAsia="Arial Narrow" w:hAnsi="Arial Narrow"/>
-              <w:b w:val="false"/>
-              <w:bCs w:val="false"/>
-              <w:i w:val="false"/>
-              <w:iCs w:val="false"/>
-              <w:sz w:val="22"/>
-              <w:szCs w:val="22"/>
-            </w:rPr>
-            <w:t xml:space="preserve">{numeroConsultor}</w:t>
-          </w:r>
-        </w:p>
-      </w:tc>
-      <w:tc>
-        <w:tcPr>
-          <w:tcW w:type="dxa" w:w="2000"/>
-          <w:tcMar>
-            <w:top w:type="dxa" w:w="40"/>
-            <w:left w:type="dxa" w:w="80"/>
-            <w:bottom w:type="dxa" w:w="40"/>
-            <w:right w:type="dxa" w:w="80"/>
-          </w:tcMar>
-          <w:vAlign w:val="center"/>
-        </w:tcPr>
-        <w:p>
-          <w:pPr>
-            <w:spacing w:after="0" w:before="0"/>
-            <w:jc w:val="center"/>
-          </w:pPr>
-          <w:r>
-            <w:rPr>
-              <w:rFonts w:ascii="Arial Narrow" w:cs="Arial Narrow" w:eastAsia="Arial Narrow" w:hAnsi="Arial Narrow"/>
-              <w:b/>
-              <w:bCs/>
-              <w:i w:val="false"/>
-              <w:iCs w:val="false"/>
-              <w:sz w:val="22"/>
-              <w:szCs w:val="22"/>
+              <w:sz w:val="20"/>
+              <w:szCs w:val="20"/>
             </w:rPr>
             <w:t xml:space="preserve">HOJA</w:t>
           </w:r>
         </w:p>
         <w:p>
           <w:pPr>
-            <w:spacing w:after="0"/>
+            <w:spacing w:before="0" w:after="0"/>
             <w:jc w:val="center"/>
           </w:pPr>
           <w:r>
             <w:rPr>
               <w:rFonts w:ascii="Arial Narrow" w:cs="Arial Narrow" w:eastAsia="Arial Narrow" w:hAnsi="Arial Narrow"/>
-              <w:sz w:val="22"/>
-              <w:szCs w:val="22"/>
+              <w:sz w:val="20"/>
+              <w:szCs w:val="20"/>
             </w:rPr>
             <w:fldChar w:fldCharType="begin"/>
             <w:instrText xml:space="preserve">PAGE</w:instrText>
@@ -6846,9 +6773,75 @@
             <w:fldChar w:fldCharType="end"/>
           </w:r>
         </w:p>
+      </w:tc>
+    </w:tr>
+    <w:tr>
+      <w:tc>
+        <w:tcPr>
+          <w:tcW w:w="5315" w:type="dxa"/>
+          <w:vMerge/>
+          <w:tcMar>
+            <w:top w:w="30" w:type="dxa"/>
+            <w:left w:w="80" w:type="dxa"/>
+            <w:bottom w:w="30" w:type="dxa"/>
+            <w:right w:w="80" w:type="dxa"/>
+          </w:tcMar>
+        </w:tcPr>
+        <w:p/>
+      </w:tc>
+      <w:tc>
+        <w:tcPr>
+          <w:tcW w:w="3333" w:type="dxa"/>
+          <w:tcMar>
+            <w:top w:w="30" w:type="dxa"/>
+            <w:left w:w="80" w:type="dxa"/>
+            <w:bottom w:w="30" w:type="dxa"/>
+            <w:right w:w="80" w:type="dxa"/>
+          </w:tcMar>
+        </w:tcPr>
         <w:p>
           <w:pPr>
-            <w:spacing w:after="0" w:before="0"/>
+            <w:spacing w:before="0" w:after="0"/>
+          </w:pPr>
+          <w:r>
+            <w:rPr>
+              <w:rFonts w:ascii="Arial Narrow" w:cs="Arial Narrow" w:eastAsia="Arial Narrow" w:hAnsi="Arial Narrow"/>
+              <w:b/>
+              <w:bCs/>
+              <w:sz w:val="20"/>
+              <w:szCs w:val="20"/>
+            </w:rPr>
+            <w:t xml:space="preserve">Nº. CONSULTOR:</w:t>
+          </w:r>
+        </w:p>
+        <w:p>
+          <w:pPr>
+            <w:spacing w:before="0" w:after="0"/>
+            <w:jc w:val="center"/>
+          </w:pPr>
+          <w:r>
+            <w:rPr>
+              <w:rFonts w:ascii="Arial Narrow" w:cs="Arial Narrow" w:eastAsia="Arial Narrow" w:hAnsi="Arial Narrow"/>
+              <w:sz w:val="20"/>
+              <w:szCs w:val="20"/>
+            </w:rPr>
+            <w:t xml:space="preserve">{numeroConsultor}</w:t>
+          </w:r>
+        </w:p>
+      </w:tc>
+      <w:tc>
+        <w:tcPr>
+          <w:tcW w:w="992" w:type="dxa"/>
+          <w:tcMar>
+            <w:top w:w="30" w:type="dxa"/>
+            <w:left w:w="80" w:type="dxa"/>
+            <w:bottom w:w="30" w:type="dxa"/>
+            <w:right w:w="80" w:type="dxa"/>
+          </w:tcMar>
+        </w:tcPr>
+        <w:p>
+          <w:pPr>
+            <w:spacing w:before="0" w:after="0"/>
             <w:jc w:val="center"/>
           </w:pPr>
           <w:r>
@@ -6856,28 +6849,22 @@
               <w:rFonts w:ascii="Arial Narrow" w:cs="Arial Narrow" w:eastAsia="Arial Narrow" w:hAnsi="Arial Narrow"/>
               <w:b/>
               <w:bCs/>
-              <w:i w:val="false"/>
-              <w:iCs w:val="false"/>
-              <w:sz w:val="22"/>
-              <w:szCs w:val="22"/>
+              <w:sz w:val="20"/>
+              <w:szCs w:val="20"/>
             </w:rPr>
             <w:t xml:space="preserve">REV.</w:t>
           </w:r>
         </w:p>
         <w:p>
           <w:pPr>
-            <w:spacing w:after="0" w:before="0"/>
+            <w:spacing w:before="0" w:after="0"/>
             <w:jc w:val="center"/>
           </w:pPr>
           <w:r>
             <w:rPr>
               <w:rFonts w:ascii="Arial Narrow" w:cs="Arial Narrow" w:eastAsia="Arial Narrow" w:hAnsi="Arial Narrow"/>
-              <w:b w:val="false"/>
-              <w:bCs w:val="false"/>
-              <w:i w:val="false"/>
-              <w:iCs w:val="false"/>
-              <w:sz w:val="22"/>
-              <w:szCs w:val="22"/>
+              <w:sz w:val="20"/>
+              <w:szCs w:val="20"/>
             </w:rPr>
             <w:t xml:space="preserve">{revision}</w:t>
           </w:r>

</xml_diff>

<commit_message>
feat(plan-trabajo): tabla de emision, firmantes, personal del cliente y referencias como la referencia NEXA
- Tabla de emision: una fila por revision (antes una por export), TE con la
  letra y 'Para Revision' como tipo, fecha dd/mm/aa, filas vacias hasta llenar
  la hoja y la leyenda de firmantes dentro de la tabla.
- Cuarto firmante 'Autorizado por' (columna Aut.) en la cabecera; migracion
  aditiva plan_trabajo.autorizadoPor/autorizadoCargo.
- Personal: los contactos del cliente del proyecto al final, con la empresa
  del cliente (no entran como filas de la RACI).
- Referencias por defecto = documentos del proyecto (propuesta, OC, planos,
  data sheets, procedimientos del cliente...) en vez de normativa generica; el
  docx ya no antepone la normativa base: exporta lo que tiene el plan.

Co-Authored-By: Claude Opus 5.5 <noreply@anthropic.com>
</commit_message>
<xml_diff>
--- a/src/lib/services/planTrabajo/templates/plan-trabajo-nexa-template.docx
+++ b/src/lib/services/planTrabajo/templates/plan-trabajo-nexa-template.docx
@@ -315,21 +315,24 @@
         </w:tc>
       </w:tr>
       <w:tr>
-        <w:tc>
-          <w:tcPr>
-            <w:tcW w:type="dxa" w:w="700"/>
-            <w:shd w:fill="D9D9D9" w:val="clear"/>
-            <w:tcMar>
-              <w:top w:type="dxa" w:w="40"/>
-              <w:left w:type="dxa" w:w="80"/>
-              <w:bottom w:type="dxa" w:w="40"/>
-              <w:right w:type="dxa" w:w="80"/>
-            </w:tcMar>
-            <w:vAlign w:val="center"/>
-          </w:tcPr>
-          <w:p>
-            <w:pPr>
-              <w:spacing w:after="120" w:before="0"/>
+        <w:trPr>
+          <w:trHeight w:val="440" w:hRule="atLeast"/>
+        </w:trPr>
+        <w:tc>
+          <w:tcPr>
+            <w:tcW w:w="700" w:type="dxa"/>
+            <w:shd w:val="clear" w:color="auto" w:fill="D9D9D9"/>
+            <w:tcMar>
+              <w:top w:w="20" w:type="dxa"/>
+              <w:left w:w="60" w:type="dxa"/>
+              <w:bottom w:w="20" w:type="dxa"/>
+              <w:right w:w="60" w:type="dxa"/>
+            </w:tcMar>
+            <w:vAlign w:val="center"/>
+          </w:tcPr>
+          <w:p>
+            <w:pPr>
+              <w:spacing w:before="0" w:after="0"/>
               <w:jc w:val="center"/>
             </w:pPr>
             <w:r>
@@ -337,8 +340,6 @@
                 <w:rFonts w:ascii="Arial Narrow" w:cs="Arial Narrow" w:eastAsia="Arial Narrow" w:hAnsi="Arial Narrow"/>
                 <w:b/>
                 <w:bCs/>
-                <w:i w:val="false"/>
-                <w:iCs w:val="false"/>
                 <w:sz w:val="22"/>
                 <w:szCs w:val="22"/>
               </w:rPr>
@@ -348,19 +349,20 @@
         </w:tc>
         <w:tc>
           <w:tcPr>
-            <w:tcW w:type="dxa" w:w="700"/>
-            <w:shd w:fill="D9D9D9" w:val="clear"/>
-            <w:tcMar>
-              <w:top w:type="dxa" w:w="40"/>
-              <w:left w:type="dxa" w:w="80"/>
-              <w:bottom w:type="dxa" w:w="40"/>
-              <w:right w:type="dxa" w:w="80"/>
-            </w:tcMar>
-            <w:vAlign w:val="center"/>
-          </w:tcPr>
-          <w:p>
-            <w:pPr>
-              <w:spacing w:after="120" w:before="0"/>
+            <w:tcW w:w="4940" w:type="dxa"/>
+            <w:gridSpan w:val="2"/>
+            <w:shd w:val="clear" w:color="auto" w:fill="D9D9D9"/>
+            <w:tcMar>
+              <w:top w:w="20" w:type="dxa"/>
+              <w:left w:w="60" w:type="dxa"/>
+              <w:bottom w:w="20" w:type="dxa"/>
+              <w:right w:w="60" w:type="dxa"/>
+            </w:tcMar>
+            <w:vAlign w:val="center"/>
+          </w:tcPr>
+          <w:p>
+            <w:pPr>
+              <w:spacing w:before="0" w:after="0"/>
               <w:jc w:val="center"/>
             </w:pPr>
             <w:r>
@@ -368,30 +370,28 @@
                 <w:rFonts w:ascii="Arial Narrow" w:cs="Arial Narrow" w:eastAsia="Arial Narrow" w:hAnsi="Arial Narrow"/>
                 <w:b/>
                 <w:bCs/>
-                <w:i w:val="false"/>
-                <w:iCs w:val="false"/>
-                <w:sz w:val="22"/>
-                <w:szCs w:val="22"/>
-              </w:rPr>
-              <w:t xml:space="preserve">TE</w:t>
-            </w:r>
-          </w:p>
-        </w:tc>
-        <w:tc>
-          <w:tcPr>
-            <w:tcW w:type="dxa" w:w="4240"/>
-            <w:shd w:fill="D9D9D9" w:val="clear"/>
-            <w:tcMar>
-              <w:top w:type="dxa" w:w="40"/>
-              <w:left w:type="dxa" w:w="80"/>
-              <w:bottom w:type="dxa" w:w="40"/>
-              <w:right w:type="dxa" w:w="80"/>
-            </w:tcMar>
-            <w:vAlign w:val="center"/>
-          </w:tcPr>
-          <w:p>
-            <w:pPr>
-              <w:spacing w:after="120" w:before="0"/>
+                <w:sz w:val="22"/>
+                <w:szCs w:val="22"/>
+              </w:rPr>
+              <w:t xml:space="preserve">TE: Tipo de Emisión</w:t>
+            </w:r>
+          </w:p>
+        </w:tc>
+        <w:tc>
+          <w:tcPr>
+            <w:tcW w:w="800" w:type="dxa"/>
+            <w:shd w:val="clear" w:color="auto" w:fill="D9D9D9"/>
+            <w:tcMar>
+              <w:top w:w="20" w:type="dxa"/>
+              <w:left w:w="60" w:type="dxa"/>
+              <w:bottom w:w="20" w:type="dxa"/>
+              <w:right w:w="60" w:type="dxa"/>
+            </w:tcMar>
+            <w:vAlign w:val="center"/>
+          </w:tcPr>
+          <w:p>
+            <w:pPr>
+              <w:spacing w:before="0" w:after="0"/>
               <w:jc w:val="center"/>
             </w:pPr>
             <w:r>
@@ -399,30 +399,28 @@
                 <w:rFonts w:ascii="Arial Narrow" w:cs="Arial Narrow" w:eastAsia="Arial Narrow" w:hAnsi="Arial Narrow"/>
                 <w:b/>
                 <w:bCs/>
-                <w:i w:val="false"/>
-                <w:iCs w:val="false"/>
-                <w:sz w:val="22"/>
-                <w:szCs w:val="22"/>
-              </w:rPr>
-              <w:t xml:space="preserve">Tipo de Emisión</w:t>
-            </w:r>
-          </w:p>
-        </w:tc>
-        <w:tc>
-          <w:tcPr>
-            <w:tcW w:type="dxa" w:w="800"/>
-            <w:shd w:fill="D9D9D9" w:val="clear"/>
-            <w:tcMar>
-              <w:top w:type="dxa" w:w="40"/>
-              <w:left w:type="dxa" w:w="80"/>
-              <w:bottom w:type="dxa" w:w="40"/>
-              <w:right w:type="dxa" w:w="80"/>
-            </w:tcMar>
-            <w:vAlign w:val="center"/>
-          </w:tcPr>
-          <w:p>
-            <w:pPr>
-              <w:spacing w:after="120" w:before="0"/>
+                <w:sz w:val="22"/>
+                <w:szCs w:val="22"/>
+              </w:rPr>
+              <w:t xml:space="preserve">Des.</w:t>
+            </w:r>
+          </w:p>
+        </w:tc>
+        <w:tc>
+          <w:tcPr>
+            <w:tcW w:w="800" w:type="dxa"/>
+            <w:shd w:val="clear" w:color="auto" w:fill="D9D9D9"/>
+            <w:tcMar>
+              <w:top w:w="20" w:type="dxa"/>
+              <w:left w:w="60" w:type="dxa"/>
+              <w:bottom w:w="20" w:type="dxa"/>
+              <w:right w:w="60" w:type="dxa"/>
+            </w:tcMar>
+            <w:vAlign w:val="center"/>
+          </w:tcPr>
+          <w:p>
+            <w:pPr>
+              <w:spacing w:before="0" w:after="0"/>
               <w:jc w:val="center"/>
             </w:pPr>
             <w:r>
@@ -430,30 +428,28 @@
                 <w:rFonts w:ascii="Arial Narrow" w:cs="Arial Narrow" w:eastAsia="Arial Narrow" w:hAnsi="Arial Narrow"/>
                 <w:b/>
                 <w:bCs/>
-                <w:i w:val="false"/>
-                <w:iCs w:val="false"/>
-                <w:sz w:val="22"/>
-                <w:szCs w:val="22"/>
-              </w:rPr>
-              <w:t xml:space="preserve">Des.</w:t>
-            </w:r>
-          </w:p>
-        </w:tc>
-        <w:tc>
-          <w:tcPr>
-            <w:tcW w:type="dxa" w:w="800"/>
-            <w:shd w:fill="D9D9D9" w:val="clear"/>
-            <w:tcMar>
-              <w:top w:type="dxa" w:w="40"/>
-              <w:left w:type="dxa" w:w="80"/>
-              <w:bottom w:type="dxa" w:w="40"/>
-              <w:right w:type="dxa" w:w="80"/>
-            </w:tcMar>
-            <w:vAlign w:val="center"/>
-          </w:tcPr>
-          <w:p>
-            <w:pPr>
-              <w:spacing w:after="120" w:before="0"/>
+                <w:sz w:val="22"/>
+                <w:szCs w:val="22"/>
+              </w:rPr>
+              <w:t xml:space="preserve">Ver.</w:t>
+            </w:r>
+          </w:p>
+        </w:tc>
+        <w:tc>
+          <w:tcPr>
+            <w:tcW w:w="800" w:type="dxa"/>
+            <w:shd w:val="clear" w:color="auto" w:fill="D9D9D9"/>
+            <w:tcMar>
+              <w:top w:w="20" w:type="dxa"/>
+              <w:left w:w="60" w:type="dxa"/>
+              <w:bottom w:w="20" w:type="dxa"/>
+              <w:right w:w="60" w:type="dxa"/>
+            </w:tcMar>
+            <w:vAlign w:val="center"/>
+          </w:tcPr>
+          <w:p>
+            <w:pPr>
+              <w:spacing w:before="0" w:after="0"/>
               <w:jc w:val="center"/>
             </w:pPr>
             <w:r>
@@ -461,30 +457,28 @@
                 <w:rFonts w:ascii="Arial Narrow" w:cs="Arial Narrow" w:eastAsia="Arial Narrow" w:hAnsi="Arial Narrow"/>
                 <w:b/>
                 <w:bCs/>
-                <w:i w:val="false"/>
-                <w:iCs w:val="false"/>
-                <w:sz w:val="22"/>
-                <w:szCs w:val="22"/>
-              </w:rPr>
-              <w:t xml:space="preserve">Ver.</w:t>
-            </w:r>
-          </w:p>
-        </w:tc>
-        <w:tc>
-          <w:tcPr>
-            <w:tcW w:type="dxa" w:w="800"/>
-            <w:shd w:fill="D9D9D9" w:val="clear"/>
-            <w:tcMar>
-              <w:top w:type="dxa" w:w="40"/>
-              <w:left w:type="dxa" w:w="80"/>
-              <w:bottom w:type="dxa" w:w="40"/>
-              <w:right w:type="dxa" w:w="80"/>
-            </w:tcMar>
-            <w:vAlign w:val="center"/>
-          </w:tcPr>
-          <w:p>
-            <w:pPr>
-              <w:spacing w:after="120" w:before="0"/>
+                <w:sz w:val="22"/>
+                <w:szCs w:val="22"/>
+              </w:rPr>
+              <w:t xml:space="preserve">Apr.</w:t>
+            </w:r>
+          </w:p>
+        </w:tc>
+        <w:tc>
+          <w:tcPr>
+            <w:tcW w:w="800" w:type="dxa"/>
+            <w:shd w:val="clear" w:color="auto" w:fill="D9D9D9"/>
+            <w:tcMar>
+              <w:top w:w="20" w:type="dxa"/>
+              <w:left w:w="60" w:type="dxa"/>
+              <w:bottom w:w="20" w:type="dxa"/>
+              <w:right w:w="60" w:type="dxa"/>
+            </w:tcMar>
+            <w:vAlign w:val="center"/>
+          </w:tcPr>
+          <w:p>
+            <w:pPr>
+              <w:spacing w:before="0" w:after="0"/>
               <w:jc w:val="center"/>
             </w:pPr>
             <w:r>
@@ -492,30 +486,28 @@
                 <w:rFonts w:ascii="Arial Narrow" w:cs="Arial Narrow" w:eastAsia="Arial Narrow" w:hAnsi="Arial Narrow"/>
                 <w:b/>
                 <w:bCs/>
-                <w:i w:val="false"/>
-                <w:iCs w:val="false"/>
-                <w:sz w:val="22"/>
-                <w:szCs w:val="22"/>
-              </w:rPr>
-              <w:t xml:space="preserve">Apr.</w:t>
-            </w:r>
-          </w:p>
-        </w:tc>
-        <w:tc>
-          <w:tcPr>
-            <w:tcW w:type="dxa" w:w="800"/>
-            <w:shd w:fill="D9D9D9" w:val="clear"/>
-            <w:tcMar>
-              <w:top w:type="dxa" w:w="40"/>
-              <w:left w:type="dxa" w:w="80"/>
-              <w:bottom w:type="dxa" w:w="40"/>
-              <w:right w:type="dxa" w:w="80"/>
-            </w:tcMar>
-            <w:vAlign w:val="center"/>
-          </w:tcPr>
-          <w:p>
-            <w:pPr>
-              <w:spacing w:after="120" w:before="0"/>
+                <w:sz w:val="22"/>
+                <w:szCs w:val="22"/>
+              </w:rPr>
+              <w:t xml:space="preserve">Aut.</w:t>
+            </w:r>
+          </w:p>
+        </w:tc>
+        <w:tc>
+          <w:tcPr>
+            <w:tcW w:w="800" w:type="dxa"/>
+            <w:shd w:val="clear" w:color="auto" w:fill="D9D9D9"/>
+            <w:tcMar>
+              <w:top w:w="20" w:type="dxa"/>
+              <w:left w:w="60" w:type="dxa"/>
+              <w:bottom w:w="20" w:type="dxa"/>
+              <w:right w:w="60" w:type="dxa"/>
+            </w:tcMar>
+            <w:vAlign w:val="center"/>
+          </w:tcPr>
+          <w:p>
+            <w:pPr>
+              <w:spacing w:before="0" w:after="0"/>
               <w:jc w:val="center"/>
             </w:pPr>
             <w:r>
@@ -523,39 +515,6 @@
                 <w:rFonts w:ascii="Arial Narrow" w:cs="Arial Narrow" w:eastAsia="Arial Narrow" w:hAnsi="Arial Narrow"/>
                 <w:b/>
                 <w:bCs/>
-                <w:i w:val="false"/>
-                <w:iCs w:val="false"/>
-                <w:sz w:val="22"/>
-                <w:szCs w:val="22"/>
-              </w:rPr>
-              <w:t xml:space="preserve">Aut.</w:t>
-            </w:r>
-          </w:p>
-        </w:tc>
-        <w:tc>
-          <w:tcPr>
-            <w:tcW w:type="dxa" w:w="800"/>
-            <w:shd w:fill="D9D9D9" w:val="clear"/>
-            <w:tcMar>
-              <w:top w:type="dxa" w:w="40"/>
-              <w:left w:type="dxa" w:w="80"/>
-              <w:bottom w:type="dxa" w:w="40"/>
-              <w:right w:type="dxa" w:w="80"/>
-            </w:tcMar>
-            <w:vAlign w:val="center"/>
-          </w:tcPr>
-          <w:p>
-            <w:pPr>
-              <w:spacing w:after="120" w:before="0"/>
-              <w:jc w:val="center"/>
-            </w:pPr>
-            <w:r>
-              <w:rPr>
-                <w:rFonts w:ascii="Arial Narrow" w:cs="Arial Narrow" w:eastAsia="Arial Narrow" w:hAnsi="Arial Narrow"/>
-                <w:b/>
-                <w:bCs/>
-                <w:i w:val="false"/>
-                <w:iCs w:val="false"/>
                 <w:sz w:val="22"/>
                 <w:szCs w:val="22"/>
               </w:rPr>
@@ -565,31 +524,30 @@
         </w:tc>
       </w:tr>
       <w:tr>
-        <w:tc>
-          <w:tcPr>
-            <w:tcW w:type="dxa" w:w="700"/>
-            <w:tcMar>
-              <w:top w:type="dxa" w:w="40"/>
-              <w:left w:type="dxa" w:w="80"/>
-              <w:bottom w:type="dxa" w:w="40"/>
-              <w:right w:type="dxa" w:w="80"/>
-            </w:tcMar>
-            <w:vAlign w:val="center"/>
-          </w:tcPr>
-          <w:p>
-            <w:pPr>
-              <w:spacing w:after="120" w:before="0"/>
+        <w:trPr>
+          <w:trHeight w:val="440" w:hRule="atLeast"/>
+        </w:trPr>
+        <w:tc>
+          <w:tcPr>
+            <w:tcW w:w="700" w:type="dxa"/>
+            <w:tcMar>
+              <w:top w:w="20" w:type="dxa"/>
+              <w:left w:w="60" w:type="dxa"/>
+              <w:bottom w:w="20" w:type="dxa"/>
+              <w:right w:w="60" w:type="dxa"/>
+            </w:tcMar>
+            <w:vAlign w:val="center"/>
+          </w:tcPr>
+          <w:p>
+            <w:pPr>
+              <w:spacing w:before="0" w:after="0"/>
               <w:jc w:val="center"/>
             </w:pPr>
             <w:r>
               <w:rPr>
                 <w:rFonts w:ascii="Arial Narrow" w:cs="Arial Narrow" w:eastAsia="Arial Narrow" w:hAnsi="Arial Narrow"/>
-                <w:b w:val="false"/>
-                <w:bCs w:val="false"/>
-                <w:i w:val="false"/>
-                <w:iCs w:val="false"/>
-                <w:sz w:val="22"/>
-                <w:szCs w:val="22"/>
+                <w:sz w:val="18"/>
+                <w:szCs w:val="18"/>
               </w:rPr>
               <w:t xml:space="preserve">{#revisiones}{rev}</w:t>
             </w:r>
@@ -597,29 +555,25 @@
         </w:tc>
         <w:tc>
           <w:tcPr>
-            <w:tcW w:type="dxa" w:w="700"/>
-            <w:tcMar>
-              <w:top w:type="dxa" w:w="40"/>
-              <w:left w:type="dxa" w:w="80"/>
-              <w:bottom w:type="dxa" w:w="40"/>
-              <w:right w:type="dxa" w:w="80"/>
-            </w:tcMar>
-            <w:vAlign w:val="center"/>
-          </w:tcPr>
-          <w:p>
-            <w:pPr>
-              <w:spacing w:after="120" w:before="0"/>
+            <w:tcW w:w="700" w:type="dxa"/>
+            <w:tcMar>
+              <w:top w:w="20" w:type="dxa"/>
+              <w:left w:w="60" w:type="dxa"/>
+              <w:bottom w:w="20" w:type="dxa"/>
+              <w:right w:w="60" w:type="dxa"/>
+            </w:tcMar>
+            <w:vAlign w:val="center"/>
+          </w:tcPr>
+          <w:p>
+            <w:pPr>
+              <w:spacing w:before="0" w:after="0"/>
               <w:jc w:val="center"/>
             </w:pPr>
             <w:r>
               <w:rPr>
                 <w:rFonts w:ascii="Arial Narrow" w:cs="Arial Narrow" w:eastAsia="Arial Narrow" w:hAnsi="Arial Narrow"/>
-                <w:b w:val="false"/>
-                <w:bCs w:val="false"/>
-                <w:i w:val="false"/>
-                <w:iCs w:val="false"/>
-                <w:sz w:val="22"/>
-                <w:szCs w:val="22"/>
+                <w:sz w:val="18"/>
+                <w:szCs w:val="18"/>
               </w:rPr>
               <w:t xml:space="preserve">{te}</w:t>
             </w:r>
@@ -627,28 +581,25 @@
         </w:tc>
         <w:tc>
           <w:tcPr>
-            <w:tcW w:type="dxa" w:w="4240"/>
-            <w:tcMar>
-              <w:top w:type="dxa" w:w="40"/>
-              <w:left w:type="dxa" w:w="80"/>
-              <w:bottom w:type="dxa" w:w="40"/>
-              <w:right w:type="dxa" w:w="80"/>
-            </w:tcMar>
-            <w:vAlign w:val="center"/>
-          </w:tcPr>
-          <w:p>
-            <w:pPr>
-              <w:spacing w:after="120" w:before="0"/>
-            </w:pPr>
-            <w:r>
-              <w:rPr>
-                <w:rFonts w:ascii="Arial Narrow" w:cs="Arial Narrow" w:eastAsia="Arial Narrow" w:hAnsi="Arial Narrow"/>
-                <w:b w:val="false"/>
-                <w:bCs w:val="false"/>
-                <w:i w:val="false"/>
-                <w:iCs w:val="false"/>
-                <w:sz w:val="22"/>
-                <w:szCs w:val="22"/>
+            <w:tcW w:w="4240" w:type="dxa"/>
+            <w:tcMar>
+              <w:top w:w="20" w:type="dxa"/>
+              <w:left w:w="60" w:type="dxa"/>
+              <w:bottom w:w="20" w:type="dxa"/>
+              <w:right w:w="60" w:type="dxa"/>
+            </w:tcMar>
+            <w:vAlign w:val="center"/>
+          </w:tcPr>
+          <w:p>
+            <w:pPr>
+              <w:spacing w:before="0" w:after="0"/>
+              <w:jc w:val="left"/>
+            </w:pPr>
+            <w:r>
+              <w:rPr>
+                <w:rFonts w:ascii="Arial Narrow" w:cs="Arial Narrow" w:eastAsia="Arial Narrow" w:hAnsi="Arial Narrow"/>
+                <w:sz w:val="18"/>
+                <w:szCs w:val="18"/>
               </w:rPr>
               <w:t xml:space="preserve">{descripcion}</w:t>
             </w:r>
@@ -656,29 +607,25 @@
         </w:tc>
         <w:tc>
           <w:tcPr>
-            <w:tcW w:type="dxa" w:w="800"/>
-            <w:tcMar>
-              <w:top w:type="dxa" w:w="40"/>
-              <w:left w:type="dxa" w:w="80"/>
-              <w:bottom w:type="dxa" w:w="40"/>
-              <w:right w:type="dxa" w:w="80"/>
-            </w:tcMar>
-            <w:vAlign w:val="center"/>
-          </w:tcPr>
-          <w:p>
-            <w:pPr>
-              <w:spacing w:after="120" w:before="0"/>
+            <w:tcW w:w="800" w:type="dxa"/>
+            <w:tcMar>
+              <w:top w:w="20" w:type="dxa"/>
+              <w:left w:w="60" w:type="dxa"/>
+              <w:bottom w:w="20" w:type="dxa"/>
+              <w:right w:w="60" w:type="dxa"/>
+            </w:tcMar>
+            <w:vAlign w:val="center"/>
+          </w:tcPr>
+          <w:p>
+            <w:pPr>
+              <w:spacing w:before="0" w:after="0"/>
               <w:jc w:val="center"/>
             </w:pPr>
             <w:r>
               <w:rPr>
                 <w:rFonts w:ascii="Arial Narrow" w:cs="Arial Narrow" w:eastAsia="Arial Narrow" w:hAnsi="Arial Narrow"/>
-                <w:b w:val="false"/>
-                <w:bCs w:val="false"/>
-                <w:i w:val="false"/>
-                <w:iCs w:val="false"/>
-                <w:sz w:val="22"/>
-                <w:szCs w:val="22"/>
+                <w:sz w:val="16"/>
+                <w:szCs w:val="16"/>
               </w:rPr>
               <w:t xml:space="preserve">{des}</w:t>
             </w:r>
@@ -686,29 +633,25 @@
         </w:tc>
         <w:tc>
           <w:tcPr>
-            <w:tcW w:type="dxa" w:w="800"/>
-            <w:tcMar>
-              <w:top w:type="dxa" w:w="40"/>
-              <w:left w:type="dxa" w:w="80"/>
-              <w:bottom w:type="dxa" w:w="40"/>
-              <w:right w:type="dxa" w:w="80"/>
-            </w:tcMar>
-            <w:vAlign w:val="center"/>
-          </w:tcPr>
-          <w:p>
-            <w:pPr>
-              <w:spacing w:after="120" w:before="0"/>
+            <w:tcW w:w="800" w:type="dxa"/>
+            <w:tcMar>
+              <w:top w:w="20" w:type="dxa"/>
+              <w:left w:w="60" w:type="dxa"/>
+              <w:bottom w:w="20" w:type="dxa"/>
+              <w:right w:w="60" w:type="dxa"/>
+            </w:tcMar>
+            <w:vAlign w:val="center"/>
+          </w:tcPr>
+          <w:p>
+            <w:pPr>
+              <w:spacing w:before="0" w:after="0"/>
               <w:jc w:val="center"/>
             </w:pPr>
             <w:r>
               <w:rPr>
                 <w:rFonts w:ascii="Arial Narrow" w:cs="Arial Narrow" w:eastAsia="Arial Narrow" w:hAnsi="Arial Narrow"/>
-                <w:b w:val="false"/>
-                <w:bCs w:val="false"/>
-                <w:i w:val="false"/>
-                <w:iCs w:val="false"/>
-                <w:sz w:val="22"/>
-                <w:szCs w:val="22"/>
+                <w:sz w:val="16"/>
+                <w:szCs w:val="16"/>
               </w:rPr>
               <w:t xml:space="preserve">{ver}</w:t>
             </w:r>
@@ -716,29 +659,25 @@
         </w:tc>
         <w:tc>
           <w:tcPr>
-            <w:tcW w:type="dxa" w:w="800"/>
-            <w:tcMar>
-              <w:top w:type="dxa" w:w="40"/>
-              <w:left w:type="dxa" w:w="80"/>
-              <w:bottom w:type="dxa" w:w="40"/>
-              <w:right w:type="dxa" w:w="80"/>
-            </w:tcMar>
-            <w:vAlign w:val="center"/>
-          </w:tcPr>
-          <w:p>
-            <w:pPr>
-              <w:spacing w:after="120" w:before="0"/>
+            <w:tcW w:w="800" w:type="dxa"/>
+            <w:tcMar>
+              <w:top w:w="20" w:type="dxa"/>
+              <w:left w:w="60" w:type="dxa"/>
+              <w:bottom w:w="20" w:type="dxa"/>
+              <w:right w:w="60" w:type="dxa"/>
+            </w:tcMar>
+            <w:vAlign w:val="center"/>
+          </w:tcPr>
+          <w:p>
+            <w:pPr>
+              <w:spacing w:before="0" w:after="0"/>
               <w:jc w:val="center"/>
             </w:pPr>
             <w:r>
               <w:rPr>
                 <w:rFonts w:ascii="Arial Narrow" w:cs="Arial Narrow" w:eastAsia="Arial Narrow" w:hAnsi="Arial Narrow"/>
-                <w:b w:val="false"/>
-                <w:bCs w:val="false"/>
-                <w:i w:val="false"/>
-                <w:iCs w:val="false"/>
-                <w:sz w:val="22"/>
-                <w:szCs w:val="22"/>
+                <w:sz w:val="16"/>
+                <w:szCs w:val="16"/>
               </w:rPr>
               <w:t xml:space="preserve">{apr}</w:t>
             </w:r>
@@ -746,29 +685,25 @@
         </w:tc>
         <w:tc>
           <w:tcPr>
-            <w:tcW w:type="dxa" w:w="800"/>
-            <w:tcMar>
-              <w:top w:type="dxa" w:w="40"/>
-              <w:left w:type="dxa" w:w="80"/>
-              <w:bottom w:type="dxa" w:w="40"/>
-              <w:right w:type="dxa" w:w="80"/>
-            </w:tcMar>
-            <w:vAlign w:val="center"/>
-          </w:tcPr>
-          <w:p>
-            <w:pPr>
-              <w:spacing w:after="120" w:before="0"/>
+            <w:tcW w:w="800" w:type="dxa"/>
+            <w:tcMar>
+              <w:top w:w="20" w:type="dxa"/>
+              <w:left w:w="60" w:type="dxa"/>
+              <w:bottom w:w="20" w:type="dxa"/>
+              <w:right w:w="60" w:type="dxa"/>
+            </w:tcMar>
+            <w:vAlign w:val="center"/>
+          </w:tcPr>
+          <w:p>
+            <w:pPr>
+              <w:spacing w:before="0" w:after="0"/>
               <w:jc w:val="center"/>
             </w:pPr>
             <w:r>
               <w:rPr>
                 <w:rFonts w:ascii="Arial Narrow" w:cs="Arial Narrow" w:eastAsia="Arial Narrow" w:hAnsi="Arial Narrow"/>
-                <w:b w:val="false"/>
-                <w:bCs w:val="false"/>
-                <w:i w:val="false"/>
-                <w:iCs w:val="false"/>
-                <w:sz w:val="22"/>
-                <w:szCs w:val="22"/>
+                <w:sz w:val="16"/>
+                <w:szCs w:val="16"/>
               </w:rPr>
               <w:t xml:space="preserve">{aut}</w:t>
             </w:r>
@@ -776,29 +711,25 @@
         </w:tc>
         <w:tc>
           <w:tcPr>
-            <w:tcW w:type="dxa" w:w="800"/>
-            <w:tcMar>
-              <w:top w:type="dxa" w:w="40"/>
-              <w:left w:type="dxa" w:w="80"/>
-              <w:bottom w:type="dxa" w:w="40"/>
-              <w:right w:type="dxa" w:w="80"/>
-            </w:tcMar>
-            <w:vAlign w:val="center"/>
-          </w:tcPr>
-          <w:p>
-            <w:pPr>
-              <w:spacing w:after="120" w:before="0"/>
+            <w:tcW w:w="800" w:type="dxa"/>
+            <w:tcMar>
+              <w:top w:w="20" w:type="dxa"/>
+              <w:left w:w="60" w:type="dxa"/>
+              <w:bottom w:w="20" w:type="dxa"/>
+              <w:right w:w="60" w:type="dxa"/>
+            </w:tcMar>
+            <w:vAlign w:val="center"/>
+          </w:tcPr>
+          <w:p>
+            <w:pPr>
+              <w:spacing w:before="0" w:after="0"/>
               <w:jc w:val="center"/>
             </w:pPr>
             <w:r>
               <w:rPr>
                 <w:rFonts w:ascii="Arial Narrow" w:cs="Arial Narrow" w:eastAsia="Arial Narrow" w:hAnsi="Arial Narrow"/>
-                <w:b w:val="false"/>
-                <w:bCs w:val="false"/>
-                <w:i w:val="false"/>
-                <w:iCs w:val="false"/>
-                <w:sz w:val="22"/>
-                <w:szCs w:val="22"/>
+                <w:sz w:val="16"/>
+                <w:szCs w:val="16"/>
               </w:rPr>
               <w:t xml:space="preserve">{fecha}{/revisiones}</w:t>
             </w:r>
@@ -806,78 +737,243 @@
         </w:tc>
       </w:tr>
       <w:tr>
-        <w:tc>
-          <w:tcPr>
-            <w:gridSpan w:val="8"/>
-            <w:tcMar>
-              <w:top w:type="dxa" w:w="40"/>
-              <w:left w:type="dxa" w:w="80"/>
-              <w:bottom w:type="dxa" w:w="40"/>
-              <w:right w:type="dxa" w:w="80"/>
-            </w:tcMar>
-            <w:vAlign w:val="center"/>
-          </w:tcPr>
-          <w:p>
-            <w:pPr>
-              <w:spacing w:after="0" w:before="0"/>
-            </w:pPr>
-            <w:r>
-              <w:rPr>
-                <w:rFonts w:ascii="Arial Narrow" w:cs="Arial Narrow" w:eastAsia="Arial Narrow" w:hAnsi="Arial Narrow"/>
-                <w:b w:val="false"/>
-                <w:bCs w:val="false"/>
-                <w:i w:val="false"/>
-                <w:iCs w:val="false"/>
-                <w:sz w:val="22"/>
-                <w:szCs w:val="22"/>
+        <w:trPr>
+          <w:trHeight w:val="440" w:hRule="atLeast"/>
+        </w:trPr>
+        <w:tc>
+          <w:tcPr>
+            <w:tcW w:w="700" w:type="dxa"/>
+            <w:tcMar>
+              <w:top w:w="20" w:type="dxa"/>
+              <w:left w:w="60" w:type="dxa"/>
+              <w:bottom w:w="20" w:type="dxa"/>
+              <w:right w:w="60" w:type="dxa"/>
+            </w:tcMar>
+            <w:vAlign w:val="center"/>
+          </w:tcPr>
+          <w:p>
+            <w:pPr>
+              <w:spacing w:before="0" w:after="0"/>
+              <w:jc w:val="center"/>
+            </w:pPr>
+            <w:r>
+              <w:rPr>
+                <w:rFonts w:ascii="Arial Narrow" w:cs="Arial Narrow" w:eastAsia="Arial Narrow" w:hAnsi="Arial Narrow"/>
+                <w:sz w:val="18"/>
+                <w:szCs w:val="18"/>
+              </w:rPr>
+              <w:t xml:space="preserve">{#filasVacias}</w:t>
+            </w:r>
+          </w:p>
+        </w:tc>
+        <w:tc>
+          <w:tcPr>
+            <w:tcW w:w="700" w:type="dxa"/>
+            <w:tcMar>
+              <w:top w:w="20" w:type="dxa"/>
+              <w:left w:w="60" w:type="dxa"/>
+              <w:bottom w:w="20" w:type="dxa"/>
+              <w:right w:w="60" w:type="dxa"/>
+            </w:tcMar>
+            <w:vAlign w:val="center"/>
+          </w:tcPr>
+          <w:p>
+            <w:pPr>
+              <w:spacing w:before="0" w:after="0"/>
+              <w:jc w:val="center"/>
+            </w:pPr>
+          </w:p>
+        </w:tc>
+        <w:tc>
+          <w:tcPr>
+            <w:tcW w:w="4240" w:type="dxa"/>
+            <w:tcMar>
+              <w:top w:w="20" w:type="dxa"/>
+              <w:left w:w="60" w:type="dxa"/>
+              <w:bottom w:w="20" w:type="dxa"/>
+              <w:right w:w="60" w:type="dxa"/>
+            </w:tcMar>
+            <w:vAlign w:val="center"/>
+          </w:tcPr>
+          <w:p>
+            <w:pPr>
+              <w:spacing w:before="0" w:after="0"/>
+              <w:jc w:val="center"/>
+            </w:pPr>
+          </w:p>
+        </w:tc>
+        <w:tc>
+          <w:tcPr>
+            <w:tcW w:w="800" w:type="dxa"/>
+            <w:tcMar>
+              <w:top w:w="20" w:type="dxa"/>
+              <w:left w:w="60" w:type="dxa"/>
+              <w:bottom w:w="20" w:type="dxa"/>
+              <w:right w:w="60" w:type="dxa"/>
+            </w:tcMar>
+            <w:vAlign w:val="center"/>
+          </w:tcPr>
+          <w:p>
+            <w:pPr>
+              <w:spacing w:before="0" w:after="0"/>
+              <w:jc w:val="center"/>
+            </w:pPr>
+          </w:p>
+        </w:tc>
+        <w:tc>
+          <w:tcPr>
+            <w:tcW w:w="800" w:type="dxa"/>
+            <w:tcMar>
+              <w:top w:w="20" w:type="dxa"/>
+              <w:left w:w="60" w:type="dxa"/>
+              <w:bottom w:w="20" w:type="dxa"/>
+              <w:right w:w="60" w:type="dxa"/>
+            </w:tcMar>
+            <w:vAlign w:val="center"/>
+          </w:tcPr>
+          <w:p>
+            <w:pPr>
+              <w:spacing w:before="0" w:after="0"/>
+              <w:jc w:val="center"/>
+            </w:pPr>
+          </w:p>
+        </w:tc>
+        <w:tc>
+          <w:tcPr>
+            <w:tcW w:w="800" w:type="dxa"/>
+            <w:tcMar>
+              <w:top w:w="20" w:type="dxa"/>
+              <w:left w:w="60" w:type="dxa"/>
+              <w:bottom w:w="20" w:type="dxa"/>
+              <w:right w:w="60" w:type="dxa"/>
+            </w:tcMar>
+            <w:vAlign w:val="center"/>
+          </w:tcPr>
+          <w:p>
+            <w:pPr>
+              <w:spacing w:before="0" w:after="0"/>
+              <w:jc w:val="center"/>
+            </w:pPr>
+          </w:p>
+        </w:tc>
+        <w:tc>
+          <w:tcPr>
+            <w:tcW w:w="800" w:type="dxa"/>
+            <w:tcMar>
+              <w:top w:w="20" w:type="dxa"/>
+              <w:left w:w="60" w:type="dxa"/>
+              <w:bottom w:w="20" w:type="dxa"/>
+              <w:right w:w="60" w:type="dxa"/>
+            </w:tcMar>
+            <w:vAlign w:val="center"/>
+          </w:tcPr>
+          <w:p>
+            <w:pPr>
+              <w:spacing w:before="0" w:after="0"/>
+              <w:jc w:val="center"/>
+            </w:pPr>
+          </w:p>
+        </w:tc>
+        <w:tc>
+          <w:tcPr>
+            <w:tcW w:w="800" w:type="dxa"/>
+            <w:tcMar>
+              <w:top w:w="20" w:type="dxa"/>
+              <w:left w:w="60" w:type="dxa"/>
+              <w:bottom w:w="20" w:type="dxa"/>
+              <w:right w:w="60" w:type="dxa"/>
+            </w:tcMar>
+            <w:vAlign w:val="center"/>
+          </w:tcPr>
+          <w:p>
+            <w:pPr>
+              <w:spacing w:before="0" w:after="0"/>
+              <w:jc w:val="center"/>
+            </w:pPr>
+            <w:r>
+              <w:rPr>
+                <w:rFonts w:ascii="Arial Narrow" w:cs="Arial Narrow" w:eastAsia="Arial Narrow" w:hAnsi="Arial Narrow"/>
+                <w:sz w:val="18"/>
+                <w:szCs w:val="18"/>
+              </w:rPr>
+              <w:t xml:space="preserve">{/filasVacias}</w:t>
+            </w:r>
+          </w:p>
+        </w:tc>
+      </w:tr>
+      <w:tr>
+        <w:trPr>
+          <w:trHeight w:val="440" w:hRule="atLeast"/>
+        </w:trPr>
+        <w:tc>
+          <w:tcPr>
+            <w:tcW w:w="700" w:type="dxa"/>
+            <w:tcMar>
+              <w:top w:w="20" w:type="dxa"/>
+              <w:left w:w="60" w:type="dxa"/>
+              <w:bottom w:w="20" w:type="dxa"/>
+              <w:right w:w="60" w:type="dxa"/>
+            </w:tcMar>
+            <w:vAlign w:val="center"/>
+          </w:tcPr>
+          <w:p>
+            <w:pPr>
+              <w:spacing w:before="0" w:after="0"/>
+              <w:jc w:val="center"/>
+            </w:pPr>
+            <w:r>
+              <w:rPr>
+                <w:rFonts w:ascii="Arial Narrow" w:cs="Arial Narrow" w:eastAsia="Arial Narrow" w:hAnsi="Arial Narrow"/>
+                <w:sz w:val="18"/>
+                <w:szCs w:val="18"/>
               </w:rPr>
               <w:t xml:space="preserve">{#firmantes}</w:t>
             </w:r>
           </w:p>
-          <w:p>
-            <w:pPr>
-              <w:spacing w:after="0" w:before="0"/>
-            </w:pPr>
-            <w:r>
-              <w:rPr>
-                <w:rFonts w:ascii="Arial Narrow" w:cs="Arial Narrow" w:eastAsia="Arial Narrow" w:hAnsi="Arial Narrow"/>
-                <w:b/>
-                <w:bCs/>
-                <w:i w:val="false"/>
-                <w:iCs w:val="false"/>
-                <w:sz w:val="22"/>
-                <w:szCs w:val="22"/>
-              </w:rPr>
-              <w:t xml:space="preserve">{siglas}: </w:t>
-            </w:r>
-            <w:r>
-              <w:rPr>
-                <w:rFonts w:ascii="Arial Narrow" w:cs="Arial Narrow" w:eastAsia="Arial Narrow" w:hAnsi="Arial Narrow"/>
-                <w:b w:val="false"/>
-                <w:bCs w:val="false"/>
-                <w:i w:val="false"/>
-                <w:iCs w:val="false"/>
-                <w:sz w:val="22"/>
-                <w:szCs w:val="22"/>
-              </w:rPr>
-              <w:t xml:space="preserve">{nombre}</w:t>
-            </w:r>
-          </w:p>
-          <w:p>
-            <w:pPr>
-              <w:spacing w:after="0" w:before="0"/>
-            </w:pPr>
-            <w:r>
-              <w:rPr>
-                <w:rFonts w:ascii="Arial Narrow" w:cs="Arial Narrow" w:eastAsia="Arial Narrow" w:hAnsi="Arial Narrow"/>
-                <w:b w:val="false"/>
-                <w:bCs w:val="false"/>
-                <w:i w:val="false"/>
-                <w:iCs w:val="false"/>
-                <w:sz w:val="22"/>
-                <w:szCs w:val="22"/>
-              </w:rPr>
-              <w:t xml:space="preserve">{/firmantes}</w:t>
+        </w:tc>
+        <w:tc>
+          <w:tcPr>
+            <w:tcW w:w="700" w:type="dxa"/>
+            <w:tcMar>
+              <w:top w:w="20" w:type="dxa"/>
+              <w:left w:w="60" w:type="dxa"/>
+              <w:bottom w:w="20" w:type="dxa"/>
+              <w:right w:w="60" w:type="dxa"/>
+            </w:tcMar>
+            <w:vAlign w:val="center"/>
+          </w:tcPr>
+          <w:p>
+            <w:pPr>
+              <w:spacing w:before="0" w:after="0"/>
+              <w:jc w:val="center"/>
+            </w:pPr>
+          </w:p>
+        </w:tc>
+        <w:tc>
+          <w:tcPr>
+            <w:tcW w:w="8240" w:type="dxa"/>
+            <w:gridSpan w:val="6"/>
+            <w:tcMar>
+              <w:top w:w="20" w:type="dxa"/>
+              <w:left w:w="60" w:type="dxa"/>
+              <w:bottom w:w="20" w:type="dxa"/>
+              <w:right w:w="60" w:type="dxa"/>
+            </w:tcMar>
+            <w:vAlign w:val="center"/>
+          </w:tcPr>
+          <w:p>
+            <w:pPr>
+              <w:spacing w:before="0" w:after="0"/>
+              <w:jc w:val="left"/>
+            </w:pPr>
+            <w:r>
+              <w:rPr>
+                <w:rFonts w:ascii="Arial Narrow" w:cs="Arial Narrow" w:eastAsia="Arial Narrow" w:hAnsi="Arial Narrow"/>
+                <w:caps/>
+                <w:sz w:val="20"/>
+                <w:szCs w:val="20"/>
+              </w:rPr>
+              <w:t xml:space="preserve">{siglas}: {nombre}{/firmantes}</w:t>
             </w:r>
           </w:p>
         </w:tc>
@@ -1168,7 +1264,7 @@
           <w:sz w:val="22"/>
           <w:szCs w:val="22"/>
         </w:rPr>
-        <w:t xml:space="preserve">{codigo} — {descripcion}</w:t>
+        <w:t xml:space="preserve">{texto}</w:t>
       </w:r>
     </w:p>
     <w:p>

</xml_diff>

<commit_message>
feat(plan-trabajo): EPP agrupado por tipo de trabajo y equipos/herramientas/materiales sin cantidades, como la referencia NEXA
Co-Authored-By: Claude Opus 5.5 <noreply@anthropic.com>
</commit_message>
<xml_diff>
--- a/src/lib/services/planTrabajo/templates/plan-trabajo-nexa-template.docx
+++ b/src/lib/services/planTrabajo/templates/plan-trabajo-nexa-template.docx
@@ -3739,30 +3739,45 @@
       <w:tr>
         <w:tc>
           <w:tcPr>
-            <w:tcW w:type="dxa" w:w="4820"/>
-            <w:tcMar>
-              <w:top w:type="dxa" w:w="40"/>
-              <w:left w:type="dxa" w:w="80"/>
-              <w:bottom w:type="dxa" w:w="40"/>
-              <w:right w:type="dxa" w:w="80"/>
-            </w:tcMar>
-            <w:vAlign w:val="center"/>
-          </w:tcPr>
-          <w:p>
-            <w:pPr>
-              <w:spacing w:after="0" w:before="0"/>
-            </w:pPr>
-            <w:r>
-              <w:rPr>
-                <w:rFonts w:ascii="Arial Narrow" w:cs="Arial Narrow" w:eastAsia="Arial Narrow" w:hAnsi="Arial Narrow"/>
-                <w:b w:val="false"/>
-                <w:bCs w:val="false"/>
-                <w:i w:val="false"/>
-                <w:iCs w:val="false"/>
-                <w:sz w:val="22"/>
-                <w:szCs w:val="22"/>
-              </w:rPr>
-              <w:t xml:space="preserve">{#eppBasico}</w:t>
+            <w:tcW w:w="4820" w:type="dxa"/>
+            <w:tcMar>
+              <w:left w:w="100" w:type="dxa"/>
+              <w:right w:w="100" w:type="dxa"/>
+            </w:tcMar>
+            <w:vAlign w:val="top"/>
+          </w:tcPr>
+          <w:p>
+            <w:pPr>
+              <w:spacing w:before="0" w:after="0"/>
+            </w:pPr>
+            <w:r>
+              <w:t xml:space="preserve">{#eppGruposBasico}</w:t>
+            </w:r>
+          </w:p>
+          <w:p>
+            <w:pPr>
+              <w:keepNext/>
+              <w:spacing w:before="160" w:after="120"/>
+              <w:jc w:val="left"/>
+            </w:pPr>
+            <w:r>
+              <w:rPr>
+                <w:rFonts w:ascii="Arial Narrow" w:cs="Arial Narrow" w:eastAsia="Arial Narrow" w:hAnsi="Arial Narrow"/>
+                <w:b/>
+                <w:bCs/>
+                <w:u w:val="single"/>
+                <w:sz w:val="22"/>
+                <w:szCs w:val="22"/>
+              </w:rPr>
+              <w:t xml:space="preserve">{titulo}:</w:t>
+            </w:r>
+          </w:p>
+          <w:p>
+            <w:pPr>
+              <w:spacing w:before="0" w:after="0"/>
+            </w:pPr>
+            <w:r>
+              <w:t xml:space="preserve">{#items}</w:t>
             </w:r>
           </w:p>
           <w:p>
@@ -3772,87 +3787,81 @@
                 <w:ilvl w:val="0"/>
                 <w:numId w:val="2"/>
               </w:numPr>
-              <w:spacing w:after="120" w:before="0"/>
-            </w:pPr>
-            <w:r>
-              <w:rPr>
-                <w:rFonts w:ascii="Arial Narrow" w:cs="Arial Narrow" w:eastAsia="Arial Narrow" w:hAnsi="Arial Narrow"/>
-                <w:b w:val="false"/>
-                <w:bCs w:val="false"/>
-                <w:i w:val="false"/>
-                <w:iCs w:val="false"/>
-                <w:sz w:val="22"/>
-                <w:szCs w:val="22"/>
-              </w:rPr>
-              <w:t xml:space="preserve">{nombre} ({norma})</w:t>
-            </w:r>
-          </w:p>
-          <w:p>
-            <w:pPr>
-              <w:spacing w:after="0" w:before="0"/>
-            </w:pPr>
-            <w:r>
-              <w:rPr>
-                <w:rFonts w:ascii="Arial Narrow" w:cs="Arial Narrow" w:eastAsia="Arial Narrow" w:hAnsi="Arial Narrow"/>
-                <w:b w:val="false"/>
-                <w:bCs w:val="false"/>
-                <w:i w:val="false"/>
-                <w:iCs w:val="false"/>
-                <w:sz w:val="22"/>
-                <w:szCs w:val="22"/>
-              </w:rPr>
-              <w:t xml:space="preserve">{/eppBasico}</w:t>
-            </w:r>
-          </w:p>
-          <w:p>
-            <w:pPr>
-              <w:spacing w:after="0" w:before="0"/>
-            </w:pPr>
-            <w:r>
-              <w:rPr>
-                <w:rFonts w:ascii="Arial Narrow" w:cs="Arial Narrow" w:eastAsia="Arial Narrow" w:hAnsi="Arial Narrow"/>
-                <w:b w:val="false"/>
-                <w:bCs w:val="false"/>
-                <w:i w:val="false"/>
-                <w:iCs w:val="false"/>
-                <w:sz w:val="22"/>
-                <w:szCs w:val="22"/>
-              </w:rPr>
-              <w:t xml:space="preserve">{#hayEppBioseguridad}</w:t>
-            </w:r>
-          </w:p>
-          <w:p>
-            <w:pPr>
-              <w:spacing w:after="0" w:before="0"/>
+              <w:spacing w:before="0" w:after="0"/>
+              <w:jc w:val="left"/>
+            </w:pPr>
+            <w:r>
+              <w:rPr>
+                <w:rFonts w:ascii="Arial Narrow" w:cs="Arial Narrow" w:eastAsia="Arial Narrow" w:hAnsi="Arial Narrow"/>
+                <w:sz w:val="22"/>
+                <w:szCs w:val="22"/>
+              </w:rPr>
+              <w:t xml:space="preserve">{texto}</w:t>
+            </w:r>
+          </w:p>
+          <w:p>
+            <w:pPr>
+              <w:spacing w:before="0" w:after="0"/>
+            </w:pPr>
+            <w:r>
+              <w:t xml:space="preserve">{/items}</w:t>
+            </w:r>
+          </w:p>
+          <w:p>
+            <w:pPr>
+              <w:spacing w:before="0" w:after="0"/>
+            </w:pPr>
+            <w:r>
+              <w:t xml:space="preserve">{/eppGruposBasico}</w:t>
+            </w:r>
+          </w:p>
+          <w:p>
+            <w:pPr>
+              <w:spacing w:before="0" w:after="120"/>
+            </w:pPr>
+          </w:p>
+        </w:tc>
+        <w:tc>
+          <w:tcPr>
+            <w:tcW w:w="4820" w:type="dxa"/>
+            <w:tcMar>
+              <w:left w:w="100" w:type="dxa"/>
+              <w:right w:w="100" w:type="dxa"/>
+            </w:tcMar>
+            <w:vAlign w:val="top"/>
+          </w:tcPr>
+          <w:p>
+            <w:pPr>
+              <w:spacing w:before="0" w:after="0"/>
+            </w:pPr>
+            <w:r>
+              <w:t xml:space="preserve">{#eppGruposRiesgo}</w:t>
+            </w:r>
+          </w:p>
+          <w:p>
+            <w:pPr>
+              <w:keepNext/>
+              <w:spacing w:before="160" w:after="120"/>
+              <w:jc w:val="left"/>
             </w:pPr>
             <w:r>
               <w:rPr>
                 <w:rFonts w:ascii="Arial Narrow" w:cs="Arial Narrow" w:eastAsia="Arial Narrow" w:hAnsi="Arial Narrow"/>
                 <w:b/>
                 <w:bCs/>
-                <w:i w:val="false"/>
-                <w:iCs w:val="false"/>
-                <w:sz w:val="22"/>
-                <w:szCs w:val="22"/>
-              </w:rPr>
-              <w:t xml:space="preserve">EPP Bioseguridad:</w:t>
-            </w:r>
-          </w:p>
-          <w:p>
-            <w:pPr>
-              <w:spacing w:after="0" w:before="0"/>
-            </w:pPr>
-            <w:r>
-              <w:rPr>
-                <w:rFonts w:ascii="Arial Narrow" w:cs="Arial Narrow" w:eastAsia="Arial Narrow" w:hAnsi="Arial Narrow"/>
-                <w:b w:val="false"/>
-                <w:bCs w:val="false"/>
-                <w:i w:val="false"/>
-                <w:iCs w:val="false"/>
-                <w:sz w:val="22"/>
-                <w:szCs w:val="22"/>
-              </w:rPr>
-              <w:t xml:space="preserve">{#eppBioseguridad}</w:t>
+                <w:u w:val="single"/>
+                <w:sz w:val="22"/>
+                <w:szCs w:val="22"/>
+              </w:rPr>
+              <w:t xml:space="preserve">{titulo}:</w:t>
+            </w:r>
+          </w:p>
+          <w:p>
+            <w:pPr>
+              <w:spacing w:before="0" w:after="0"/>
+            </w:pPr>
+            <w:r>
+              <w:t xml:space="preserve">{#items}</w:t>
             </w:r>
           </w:p>
           <w:p>
@@ -3862,122 +3871,38 @@
                 <w:ilvl w:val="0"/>
                 <w:numId w:val="2"/>
               </w:numPr>
-              <w:spacing w:after="120" w:before="0"/>
-            </w:pPr>
-            <w:r>
-              <w:rPr>
-                <w:rFonts w:ascii="Arial Narrow" w:cs="Arial Narrow" w:eastAsia="Arial Narrow" w:hAnsi="Arial Narrow"/>
-                <w:b w:val="false"/>
-                <w:bCs w:val="false"/>
-                <w:i w:val="false"/>
-                <w:iCs w:val="false"/>
-                <w:sz w:val="22"/>
-                <w:szCs w:val="22"/>
-              </w:rPr>
-              <w:t xml:space="preserve">{nombre} ({norma})</w:t>
-            </w:r>
-          </w:p>
-          <w:p>
-            <w:pPr>
-              <w:spacing w:after="0" w:before="0"/>
-            </w:pPr>
-            <w:r>
-              <w:rPr>
-                <w:rFonts w:ascii="Arial Narrow" w:cs="Arial Narrow" w:eastAsia="Arial Narrow" w:hAnsi="Arial Narrow"/>
-                <w:b w:val="false"/>
-                <w:bCs w:val="false"/>
-                <w:i w:val="false"/>
-                <w:iCs w:val="false"/>
-                <w:sz w:val="22"/>
-                <w:szCs w:val="22"/>
-              </w:rPr>
-              <w:t xml:space="preserve">{/eppBioseguridad}</w:t>
-            </w:r>
-          </w:p>
-          <w:p>
-            <w:pPr>
-              <w:spacing w:after="0" w:before="0"/>
-            </w:pPr>
-            <w:r>
-              <w:rPr>
-                <w:rFonts w:ascii="Arial Narrow" w:cs="Arial Narrow" w:eastAsia="Arial Narrow" w:hAnsi="Arial Narrow"/>
-                <w:b w:val="false"/>
-                <w:bCs w:val="false"/>
-                <w:i w:val="false"/>
-                <w:iCs w:val="false"/>
-                <w:sz w:val="22"/>
-                <w:szCs w:val="22"/>
-              </w:rPr>
-              <w:t xml:space="preserve">{/hayEppBioseguridad}</w:t>
-            </w:r>
-          </w:p>
-        </w:tc>
-        <w:tc>
-          <w:tcPr>
-            <w:tcW w:type="dxa" w:w="4820"/>
-            <w:tcMar>
-              <w:top w:type="dxa" w:w="40"/>
-              <w:left w:type="dxa" w:w="80"/>
-              <w:bottom w:type="dxa" w:w="40"/>
-              <w:right w:type="dxa" w:w="80"/>
-            </w:tcMar>
-            <w:vAlign w:val="center"/>
-          </w:tcPr>
-          <w:p>
-            <w:pPr>
-              <w:spacing w:after="0" w:before="0"/>
-            </w:pPr>
-            <w:r>
-              <w:rPr>
-                <w:rFonts w:ascii="Arial Narrow" w:cs="Arial Narrow" w:eastAsia="Arial Narrow" w:hAnsi="Arial Narrow"/>
-                <w:b w:val="false"/>
-                <w:bCs w:val="false"/>
-                <w:i w:val="false"/>
-                <w:iCs w:val="false"/>
-                <w:sz w:val="22"/>
-                <w:szCs w:val="22"/>
-              </w:rPr>
-              <w:t xml:space="preserve">{#eppRiesgoEspecifico}</w:t>
-            </w:r>
-          </w:p>
-          <w:p>
-            <w:pPr>
-              <w:pStyle w:val="ListParagraph"/>
-              <w:numPr>
-                <w:ilvl w:val="0"/>
-                <w:numId w:val="2"/>
-              </w:numPr>
-              <w:spacing w:after="120" w:before="0"/>
-            </w:pPr>
-            <w:r>
-              <w:rPr>
-                <w:rFonts w:ascii="Arial Narrow" w:cs="Arial Narrow" w:eastAsia="Arial Narrow" w:hAnsi="Arial Narrow"/>
-                <w:b w:val="false"/>
-                <w:bCs w:val="false"/>
-                <w:i w:val="false"/>
-                <w:iCs w:val="false"/>
-                <w:sz w:val="22"/>
-                <w:szCs w:val="22"/>
-              </w:rPr>
-              <w:t xml:space="preserve">{nombre} ({norma})</w:t>
-            </w:r>
-          </w:p>
-          <w:p>
-            <w:pPr>
-              <w:spacing w:after="0" w:before="0"/>
-            </w:pPr>
-            <w:r>
-              <w:rPr>
-                <w:rFonts w:ascii="Arial Narrow" w:cs="Arial Narrow" w:eastAsia="Arial Narrow" w:hAnsi="Arial Narrow"/>
-                <w:b w:val="false"/>
-                <w:bCs w:val="false"/>
-                <w:i w:val="false"/>
-                <w:iCs w:val="false"/>
-                <w:sz w:val="22"/>
-                <w:szCs w:val="22"/>
-              </w:rPr>
-              <w:t xml:space="preserve">{/eppRiesgoEspecifico}</w:t>
-            </w:r>
+              <w:spacing w:before="0" w:after="0"/>
+              <w:jc w:val="left"/>
+            </w:pPr>
+            <w:r>
+              <w:rPr>
+                <w:rFonts w:ascii="Arial Narrow" w:cs="Arial Narrow" w:eastAsia="Arial Narrow" w:hAnsi="Arial Narrow"/>
+                <w:sz w:val="22"/>
+                <w:szCs w:val="22"/>
+              </w:rPr>
+              <w:t xml:space="preserve">{texto}</w:t>
+            </w:r>
+          </w:p>
+          <w:p>
+            <w:pPr>
+              <w:spacing w:before="0" w:after="0"/>
+            </w:pPr>
+            <w:r>
+              <w:t xml:space="preserve">{/items}</w:t>
+            </w:r>
+          </w:p>
+          <w:p>
+            <w:pPr>
+              <w:spacing w:before="0" w:after="0"/>
+            </w:pPr>
+            <w:r>
+              <w:t xml:space="preserve">{/eppGruposRiesgo}</w:t>
+            </w:r>
+          </w:p>
+          <w:p>
+            <w:pPr>
+              <w:spacing w:before="0" w:after="120"/>
+            </w:pPr>
           </w:p>
         </w:tc>
       </w:tr>
@@ -4122,7 +4047,7 @@
               <w:bottom w:type="dxa" w:w="40"/>
               <w:right w:type="dxa" w:w="80"/>
             </w:tcMar>
-            <w:vAlign w:val="center"/>
+            <w:vAlign w:val="top"/>
           </w:tcPr>
           <w:p>
             <w:pPr>
@@ -4148,19 +4073,16 @@
                 <w:ilvl w:val="0"/>
                 <w:numId w:val="2"/>
               </w:numPr>
-              <w:spacing w:after="120" w:before="0"/>
-            </w:pPr>
-            <w:r>
-              <w:rPr>
-                <w:rFonts w:ascii="Arial Narrow" w:cs="Arial Narrow" w:eastAsia="Arial Narrow" w:hAnsi="Arial Narrow"/>
-                <w:b w:val="false"/>
-                <w:bCs w:val="false"/>
-                <w:i w:val="false"/>
-                <w:iCs w:val="false"/>
-                <w:sz w:val="22"/>
-                <w:szCs w:val="22"/>
-              </w:rPr>
-              <w:t xml:space="preserve">{nombre} — {cantidad}</w:t>
+              <w:spacing w:before="0" w:after="0"/>
+              <w:jc w:val="left"/>
+            </w:pPr>
+            <w:r>
+              <w:rPr>
+                <w:rFonts w:ascii="Arial Narrow" w:cs="Arial Narrow" w:eastAsia="Arial Narrow" w:hAnsi="Arial Narrow"/>
+                <w:sz w:val="22"/>
+                <w:szCs w:val="22"/>
+              </w:rPr>
+              <w:t xml:space="preserve">{texto}</w:t>
             </w:r>
           </w:p>
           <w:p>
@@ -4190,7 +4112,7 @@
               <w:bottom w:type="dxa" w:w="40"/>
               <w:right w:type="dxa" w:w="80"/>
             </w:tcMar>
-            <w:vAlign w:val="center"/>
+            <w:vAlign w:val="top"/>
           </w:tcPr>
           <w:p>
             <w:pPr>
@@ -4216,19 +4138,16 @@
                 <w:ilvl w:val="0"/>
                 <w:numId w:val="2"/>
               </w:numPr>
-              <w:spacing w:after="120" w:before="0"/>
-            </w:pPr>
-            <w:r>
-              <w:rPr>
-                <w:rFonts w:ascii="Arial Narrow" w:cs="Arial Narrow" w:eastAsia="Arial Narrow" w:hAnsi="Arial Narrow"/>
-                <w:b w:val="false"/>
-                <w:bCs w:val="false"/>
-                <w:i w:val="false"/>
-                <w:iCs w:val="false"/>
-                <w:sz w:val="22"/>
-                <w:szCs w:val="22"/>
-              </w:rPr>
-              <w:t xml:space="preserve">{nombre} — {cantidad}</w:t>
+              <w:spacing w:before="0" w:after="0"/>
+              <w:jc w:val="left"/>
+            </w:pPr>
+            <w:r>
+              <w:rPr>
+                <w:rFonts w:ascii="Arial Narrow" w:cs="Arial Narrow" w:eastAsia="Arial Narrow" w:hAnsi="Arial Narrow"/>
+                <w:sz w:val="22"/>
+                <w:szCs w:val="22"/>
+              </w:rPr>
+              <w:t xml:space="preserve">{texto}</w:t>
             </w:r>
           </w:p>
           <w:p>
@@ -4258,7 +4177,7 @@
               <w:bottom w:type="dxa" w:w="40"/>
               <w:right w:type="dxa" w:w="80"/>
             </w:tcMar>
-            <w:vAlign w:val="center"/>
+            <w:vAlign w:val="top"/>
           </w:tcPr>
           <w:p>
             <w:pPr>
@@ -4284,19 +4203,16 @@
                 <w:ilvl w:val="0"/>
                 <w:numId w:val="2"/>
               </w:numPr>
-              <w:spacing w:after="120" w:before="0"/>
-            </w:pPr>
-            <w:r>
-              <w:rPr>
-                <w:rFonts w:ascii="Arial Narrow" w:cs="Arial Narrow" w:eastAsia="Arial Narrow" w:hAnsi="Arial Narrow"/>
-                <w:b w:val="false"/>
-                <w:bCs w:val="false"/>
-                <w:i w:val="false"/>
-                <w:iCs w:val="false"/>
-                <w:sz w:val="22"/>
-                <w:szCs w:val="22"/>
-              </w:rPr>
-              <w:t xml:space="preserve">{nombre} — {cantidad}</w:t>
+              <w:spacing w:before="0" w:after="0"/>
+              <w:jc w:val="left"/>
+            </w:pPr>
+            <w:r>
+              <w:rPr>
+                <w:rFonts w:ascii="Arial Narrow" w:cs="Arial Narrow" w:eastAsia="Arial Narrow" w:hAnsi="Arial Narrow"/>
+                <w:sz w:val="22"/>
+                <w:szCs w:val="22"/>
+              </w:rPr>
+              <w:t xml:space="preserve">{texto}</w:t>
             </w:r>
           </w:p>
           <w:p>

</xml_diff>

<commit_message>
feat(plan-trabajo): histogramas del docx como graficos nativos de Word editables, en vez de imagen
Co-Authored-By: Claude Opus 5.5 <noreply@anthropic.com>
</commit_message>
<xml_diff>
--- a/src/lib/services/planTrabajo/templates/plan-trabajo-nexa-template.docx
+++ b/src/lib/services/planTrabajo/templates/plan-trabajo-nexa-template.docx
@@ -5186,7 +5186,7 @@
           <w:sz w:val="22"/>
           <w:szCs w:val="22"/>
         </w:rPr>
-        <w:t xml:space="preserve">{%histogramaEquipoPng}</w:t>
+        <w:t xml:space="preserve">{graficoEquipo}</w:t>
       </w:r>
     </w:p>
     <w:p>
@@ -5461,7 +5461,7 @@
           <w:sz w:val="22"/>
           <w:szCs w:val="22"/>
         </w:rPr>
-        <w:t xml:space="preserve">{%histogramaHHPng}</w:t>
+        <w:t xml:space="preserve">{graficoHH}</w:t>
       </w:r>
     </w:p>
     <w:p>
@@ -5829,7 +5829,7 @@
           <w:sz w:val="22"/>
           <w:szCs w:val="22"/>
         </w:rPr>
-        <w:t xml:space="preserve">{%histogramaHHActividadPng}</w:t>
+        <w:t xml:space="preserve">{graficoHHActividad}</w:t>
       </w:r>
     </w:p>
     <w:p>

</xml_diff>

<commit_message>
feat(plan-trabajo): tablas de histogramas del docx con una columna por mes y totales mensuales
Co-Authored-By: Claude Opus 5.5 <noreply@anthropic.com>
</commit_message>
<xml_diff>
--- a/src/lib/services/planTrabajo/templates/plan-trabajo-nexa-template.docx
+++ b/src/lib/services/planTrabajo/templates/plan-trabajo-nexa-template.docx
@@ -5207,209 +5207,14 @@
         <w:t xml:space="preserve">{/tieneHistogramaEquipoPng}</w:t>
       </w:r>
     </w:p>
-    <w:tbl>
-      <w:tblPr>
-        <w:tblW w:type="dxa" w:w="9640"/>
-        <w:tblBorders>
-          <w:top w:val="single" w:color="auto" w:sz="4"/>
-          <w:left w:val="single" w:color="auto" w:sz="4"/>
-          <w:bottom w:val="single" w:color="auto" w:sz="4"/>
-          <w:right w:val="single" w:color="auto" w:sz="4"/>
-          <w:insideH w:val="single" w:color="auto" w:sz="4"/>
-          <w:insideV w:val="single" w:color="auto" w:sz="4"/>
-        </w:tblBorders>
-      </w:tblPr>
-      <w:tblGrid>
-        <w:gridCol w:w="3800"/>
-        <w:gridCol w:w="4340"/>
-        <w:gridCol w:w="1500"/>
-      </w:tblGrid>
-      <w:tr>
-        <w:tc>
-          <w:tcPr>
-            <w:tcW w:type="dxa" w:w="3800"/>
-            <w:shd w:fill="D9D9D9" w:val="clear"/>
-            <w:tcMar>
-              <w:top w:type="dxa" w:w="40"/>
-              <w:left w:type="dxa" w:w="80"/>
-              <w:bottom w:type="dxa" w:w="40"/>
-              <w:right w:type="dxa" w:w="80"/>
-            </w:tcMar>
-            <w:vAlign w:val="center"/>
-          </w:tcPr>
-          <w:p>
-            <w:pPr>
-              <w:spacing w:after="120" w:before="0"/>
-              <w:jc w:val="center"/>
-            </w:pPr>
-            <w:r>
-              <w:rPr>
-                <w:rFonts w:ascii="Arial Narrow" w:cs="Arial Narrow" w:eastAsia="Arial Narrow" w:hAnsi="Arial Narrow"/>
-                <w:b/>
-                <w:bCs/>
-                <w:i w:val="false"/>
-                <w:iCs w:val="false"/>
-                <w:sz w:val="22"/>
-                <w:szCs w:val="22"/>
-              </w:rPr>
-              <w:t xml:space="preserve">PERSONAL / CARGO</w:t>
-            </w:r>
-          </w:p>
-        </w:tc>
-        <w:tc>
-          <w:tcPr>
-            <w:tcW w:type="dxa" w:w="4340"/>
-            <w:shd w:fill="D9D9D9" w:val="clear"/>
-            <w:tcMar>
-              <w:top w:type="dxa" w:w="40"/>
-              <w:left w:type="dxa" w:w="80"/>
-              <w:bottom w:type="dxa" w:w="40"/>
-              <w:right w:type="dxa" w:w="80"/>
-            </w:tcMar>
-            <w:vAlign w:val="center"/>
-          </w:tcPr>
-          <w:p>
-            <w:pPr>
-              <w:spacing w:after="120" w:before="0"/>
-              <w:jc w:val="center"/>
-            </w:pPr>
-            <w:r>
-              <w:rPr>
-                <w:rFonts w:ascii="Arial Narrow" w:cs="Arial Narrow" w:eastAsia="Arial Narrow" w:hAnsi="Arial Narrow"/>
-                <w:b/>
-                <w:bCs/>
-                <w:i w:val="false"/>
-                <w:iCs w:val="false"/>
-                <w:sz w:val="22"/>
-                <w:szCs w:val="22"/>
-              </w:rPr>
-              <w:t xml:space="preserve">DETALLE POR MES</w:t>
-            </w:r>
-          </w:p>
-        </w:tc>
-        <w:tc>
-          <w:tcPr>
-            <w:tcW w:type="dxa" w:w="1500"/>
-            <w:shd w:fill="D9D9D9" w:val="clear"/>
-            <w:tcMar>
-              <w:top w:type="dxa" w:w="40"/>
-              <w:left w:type="dxa" w:w="80"/>
-              <w:bottom w:type="dxa" w:w="40"/>
-              <w:right w:type="dxa" w:w="80"/>
-            </w:tcMar>
-            <w:vAlign w:val="center"/>
-          </w:tcPr>
-          <w:p>
-            <w:pPr>
-              <w:spacing w:after="120" w:before="0"/>
-              <w:jc w:val="center"/>
-            </w:pPr>
-            <w:r>
-              <w:rPr>
-                <w:rFonts w:ascii="Arial Narrow" w:cs="Arial Narrow" w:eastAsia="Arial Narrow" w:hAnsi="Arial Narrow"/>
-                <w:b/>
-                <w:bCs/>
-                <w:i w:val="false"/>
-                <w:iCs w:val="false"/>
-                <w:sz w:val="22"/>
-                <w:szCs w:val="22"/>
-              </w:rPr>
-              <w:t xml:space="preserve">MÁX.</w:t>
-            </w:r>
-          </w:p>
-        </w:tc>
-      </w:tr>
-      <w:tr>
-        <w:tc>
-          <w:tcPr>
-            <w:tcW w:type="dxa" w:w="3800"/>
-            <w:tcMar>
-              <w:top w:type="dxa" w:w="40"/>
-              <w:left w:type="dxa" w:w="80"/>
-              <w:bottom w:type="dxa" w:w="40"/>
-              <w:right w:type="dxa" w:w="80"/>
-            </w:tcMar>
-            <w:vAlign w:val="center"/>
-          </w:tcPr>
-          <w:p>
-            <w:pPr>
-              <w:spacing w:after="120" w:before="0"/>
-            </w:pPr>
-            <w:r>
-              <w:rPr>
-                <w:rFonts w:ascii="Arial Narrow" w:cs="Arial Narrow" w:eastAsia="Arial Narrow" w:hAnsi="Arial Narrow"/>
-                <w:b w:val="false"/>
-                <w:bCs w:val="false"/>
-                <w:i w:val="false"/>
-                <w:iCs w:val="false"/>
-                <w:sz w:val="22"/>
-                <w:szCs w:val="22"/>
-              </w:rPr>
-              <w:t xml:space="preserve">{#histogramaEquipo}{etiqueta}</w:t>
-            </w:r>
-          </w:p>
-        </w:tc>
-        <w:tc>
-          <w:tcPr>
-            <w:tcW w:type="dxa" w:w="4340"/>
-            <w:tcMar>
-              <w:top w:type="dxa" w:w="40"/>
-              <w:left w:type="dxa" w:w="80"/>
-              <w:bottom w:type="dxa" w:w="40"/>
-              <w:right w:type="dxa" w:w="80"/>
-            </w:tcMar>
-            <w:vAlign w:val="center"/>
-          </w:tcPr>
-          <w:p>
-            <w:pPr>
-              <w:spacing w:after="120" w:before="0"/>
-            </w:pPr>
-            <w:r>
-              <w:rPr>
-                <w:rFonts w:ascii="Arial Narrow" w:cs="Arial Narrow" w:eastAsia="Arial Narrow" w:hAnsi="Arial Narrow"/>
-                <w:b w:val="false"/>
-                <w:bCs w:val="false"/>
-                <w:i w:val="false"/>
-                <w:iCs w:val="false"/>
-                <w:sz w:val="22"/>
-                <w:szCs w:val="22"/>
-              </w:rPr>
-              <w:t xml:space="preserve">{detalleMeses}</w:t>
-            </w:r>
-          </w:p>
-        </w:tc>
-        <w:tc>
-          <w:tcPr>
-            <w:tcW w:type="dxa" w:w="1500"/>
-            <w:tcMar>
-              <w:top w:type="dxa" w:w="40"/>
-              <w:left w:type="dxa" w:w="80"/>
-              <w:bottom w:type="dxa" w:w="40"/>
-              <w:right w:type="dxa" w:w="80"/>
-            </w:tcMar>
-            <w:vAlign w:val="center"/>
-          </w:tcPr>
-          <w:p>
-            <w:pPr>
-              <w:spacing w:after="120" w:before="0"/>
-              <w:jc w:val="center"/>
-            </w:pPr>
-            <w:r>
-              <w:rPr>
-                <w:rFonts w:ascii="Arial Narrow" w:cs="Arial Narrow" w:eastAsia="Arial Narrow" w:hAnsi="Arial Narrow"/>
-                <w:b w:val="false"/>
-                <w:bCs w:val="false"/>
-                <w:i w:val="false"/>
-                <w:iCs w:val="false"/>
-                <w:sz w:val="22"/>
-                <w:szCs w:val="22"/>
-              </w:rPr>
-              <w:t xml:space="preserve">{total}{/histogramaEquipo}</w:t>
-            </w:r>
-          </w:p>
-        </w:tc>
-      </w:tr>
-    </w:tbl>
+    <w:p>
+      <w:pPr>
+        <w:spacing w:before="0" w:after="0"/>
+      </w:pPr>
+      <w:r>
+        <w:t xml:space="preserve">{tablaHistogramaEquipo}</w:t>
+      </w:r>
+    </w:p>
     <w:p>
       <w:pPr>
         <w:pStyle w:val="Heading2"/>
@@ -5482,302 +5287,14 @@
         <w:t xml:space="preserve">{/tieneHistogramaHHPng}</w:t>
       </w:r>
     </w:p>
-    <w:tbl>
-      <w:tblPr>
-        <w:tblW w:type="dxa" w:w="9640"/>
-        <w:tblBorders>
-          <w:top w:val="single" w:color="auto" w:sz="4"/>
-          <w:left w:val="single" w:color="auto" w:sz="4"/>
-          <w:bottom w:val="single" w:color="auto" w:sz="4"/>
-          <w:right w:val="single" w:color="auto" w:sz="4"/>
-          <w:insideH w:val="single" w:color="auto" w:sz="4"/>
-          <w:insideV w:val="single" w:color="auto" w:sz="4"/>
-        </w:tblBorders>
-      </w:tblPr>
-      <w:tblGrid>
-        <w:gridCol w:w="3800"/>
-        <w:gridCol w:w="4340"/>
-        <w:gridCol w:w="1500"/>
-      </w:tblGrid>
-      <w:tr>
-        <w:tc>
-          <w:tcPr>
-            <w:tcW w:type="dxa" w:w="3800"/>
-            <w:shd w:fill="D9D9D9" w:val="clear"/>
-            <w:tcMar>
-              <w:top w:type="dxa" w:w="40"/>
-              <w:left w:type="dxa" w:w="80"/>
-              <w:bottom w:type="dxa" w:w="40"/>
-              <w:right w:type="dxa" w:w="80"/>
-            </w:tcMar>
-            <w:vAlign w:val="center"/>
-          </w:tcPr>
-          <w:p>
-            <w:pPr>
-              <w:spacing w:after="120" w:before="0"/>
-              <w:jc w:val="center"/>
-            </w:pPr>
-            <w:r>
-              <w:rPr>
-                <w:rFonts w:ascii="Arial Narrow" w:cs="Arial Narrow" w:eastAsia="Arial Narrow" w:hAnsi="Arial Narrow"/>
-                <w:b/>
-                <w:bCs/>
-                <w:i w:val="false"/>
-                <w:iCs w:val="false"/>
-                <w:sz w:val="22"/>
-                <w:szCs w:val="22"/>
-              </w:rPr>
-              <w:t xml:space="preserve">EDT / PERSONAL</w:t>
-            </w:r>
-          </w:p>
-        </w:tc>
-        <w:tc>
-          <w:tcPr>
-            <w:tcW w:type="dxa" w:w="4340"/>
-            <w:shd w:fill="D9D9D9" w:val="clear"/>
-            <w:tcMar>
-              <w:top w:type="dxa" w:w="40"/>
-              <w:left w:type="dxa" w:w="80"/>
-              <w:bottom w:type="dxa" w:w="40"/>
-              <w:right w:type="dxa" w:w="80"/>
-            </w:tcMar>
-            <w:vAlign w:val="center"/>
-          </w:tcPr>
-          <w:p>
-            <w:pPr>
-              <w:spacing w:after="120" w:before="0"/>
-              <w:jc w:val="center"/>
-            </w:pPr>
-            <w:r>
-              <w:rPr>
-                <w:rFonts w:ascii="Arial Narrow" w:cs="Arial Narrow" w:eastAsia="Arial Narrow" w:hAnsi="Arial Narrow"/>
-                <w:b/>
-                <w:bCs/>
-                <w:i w:val="false"/>
-                <w:iCs w:val="false"/>
-                <w:sz w:val="22"/>
-                <w:szCs w:val="22"/>
-              </w:rPr>
-              <w:t xml:space="preserve">DETALLE POR MES (HH)</w:t>
-            </w:r>
-          </w:p>
-        </w:tc>
-        <w:tc>
-          <w:tcPr>
-            <w:tcW w:type="dxa" w:w="1500"/>
-            <w:shd w:fill="D9D9D9" w:val="clear"/>
-            <w:tcMar>
-              <w:top w:type="dxa" w:w="40"/>
-              <w:left w:type="dxa" w:w="80"/>
-              <w:bottom w:type="dxa" w:w="40"/>
-              <w:right w:type="dxa" w:w="80"/>
-            </w:tcMar>
-            <w:vAlign w:val="center"/>
-          </w:tcPr>
-          <w:p>
-            <w:pPr>
-              <w:spacing w:after="120" w:before="0"/>
-              <w:jc w:val="center"/>
-            </w:pPr>
-            <w:r>
-              <w:rPr>
-                <w:rFonts w:ascii="Arial Narrow" w:cs="Arial Narrow" w:eastAsia="Arial Narrow" w:hAnsi="Arial Narrow"/>
-                <w:b/>
-                <w:bCs/>
-                <w:i w:val="false"/>
-                <w:iCs w:val="false"/>
-                <w:sz w:val="22"/>
-                <w:szCs w:val="22"/>
-              </w:rPr>
-              <w:t xml:space="preserve">TOTAL HH</w:t>
-            </w:r>
-          </w:p>
-        </w:tc>
-      </w:tr>
-      <w:tr>
-        <w:tc>
-          <w:tcPr>
-            <w:tcW w:type="dxa" w:w="3800"/>
-            <w:tcMar>
-              <w:top w:type="dxa" w:w="40"/>
-              <w:left w:type="dxa" w:w="80"/>
-              <w:bottom w:type="dxa" w:w="40"/>
-              <w:right w:type="dxa" w:w="80"/>
-            </w:tcMar>
-            <w:vAlign w:val="center"/>
-          </w:tcPr>
-          <w:p>
-            <w:pPr>
-              <w:spacing w:after="120" w:before="0"/>
-            </w:pPr>
-            <w:r>
-              <w:rPr>
-                <w:rFonts w:ascii="Arial Narrow" w:cs="Arial Narrow" w:eastAsia="Arial Narrow" w:hAnsi="Arial Narrow"/>
-                <w:b w:val="false"/>
-                <w:bCs w:val="false"/>
-                <w:i w:val="false"/>
-                <w:iCs w:val="false"/>
-                <w:sz w:val="22"/>
-                <w:szCs w:val="22"/>
-              </w:rPr>
-              <w:t xml:space="preserve">{#histogramaHH}{etiqueta}</w:t>
-            </w:r>
-          </w:p>
-        </w:tc>
-        <w:tc>
-          <w:tcPr>
-            <w:tcW w:type="dxa" w:w="4340"/>
-            <w:tcMar>
-              <w:top w:type="dxa" w:w="40"/>
-              <w:left w:type="dxa" w:w="80"/>
-              <w:bottom w:type="dxa" w:w="40"/>
-              <w:right w:type="dxa" w:w="80"/>
-            </w:tcMar>
-            <w:vAlign w:val="center"/>
-          </w:tcPr>
-          <w:p>
-            <w:pPr>
-              <w:spacing w:after="120" w:before="0"/>
-            </w:pPr>
-            <w:r>
-              <w:rPr>
-                <w:rFonts w:ascii="Arial Narrow" w:cs="Arial Narrow" w:eastAsia="Arial Narrow" w:hAnsi="Arial Narrow"/>
-                <w:b w:val="false"/>
-                <w:bCs w:val="false"/>
-                <w:i w:val="false"/>
-                <w:iCs w:val="false"/>
-                <w:sz w:val="22"/>
-                <w:szCs w:val="22"/>
-              </w:rPr>
-              <w:t xml:space="preserve">{detalleMeses}</w:t>
-            </w:r>
-          </w:p>
-        </w:tc>
-        <w:tc>
-          <w:tcPr>
-            <w:tcW w:type="dxa" w:w="1500"/>
-            <w:tcMar>
-              <w:top w:type="dxa" w:w="40"/>
-              <w:left w:type="dxa" w:w="80"/>
-              <w:bottom w:type="dxa" w:w="40"/>
-              <w:right w:type="dxa" w:w="80"/>
-            </w:tcMar>
-            <w:vAlign w:val="center"/>
-          </w:tcPr>
-          <w:p>
-            <w:pPr>
-              <w:spacing w:after="120" w:before="0"/>
-              <w:jc w:val="center"/>
-            </w:pPr>
-            <w:r>
-              <w:rPr>
-                <w:rFonts w:ascii="Arial Narrow" w:cs="Arial Narrow" w:eastAsia="Arial Narrow" w:hAnsi="Arial Narrow"/>
-                <w:b w:val="false"/>
-                <w:bCs w:val="false"/>
-                <w:i w:val="false"/>
-                <w:iCs w:val="false"/>
-                <w:sz w:val="22"/>
-                <w:szCs w:val="22"/>
-              </w:rPr>
-              <w:t xml:space="preserve">{total}{/histogramaHH}</w:t>
-            </w:r>
-          </w:p>
-        </w:tc>
-      </w:tr>
-      <w:tr>
-        <w:tc>
-          <w:tcPr>
-            <w:tcW w:type="dxa" w:w="3800"/>
-            <w:shd w:fill="D9D9D9" w:val="clear"/>
-            <w:tcMar>
-              <w:top w:type="dxa" w:w="40"/>
-              <w:left w:type="dxa" w:w="80"/>
-              <w:bottom w:type="dxa" w:w="40"/>
-              <w:right w:type="dxa" w:w="80"/>
-            </w:tcMar>
-            <w:vAlign w:val="center"/>
-          </w:tcPr>
-          <w:p>
-            <w:pPr>
-              <w:spacing w:after="120" w:before="0"/>
-            </w:pPr>
-            <w:r>
-              <w:rPr>
-                <w:rFonts w:ascii="Arial Narrow" w:cs="Arial Narrow" w:eastAsia="Arial Narrow" w:hAnsi="Arial Narrow"/>
-                <w:b/>
-                <w:bCs/>
-                <w:i w:val="false"/>
-                <w:iCs w:val="false"/>
-                <w:sz w:val="22"/>
-                <w:szCs w:val="22"/>
-              </w:rPr>
-              <w:t xml:space="preserve">TOTAL GENERAL</w:t>
-            </w:r>
-          </w:p>
-        </w:tc>
-        <w:tc>
-          <w:tcPr>
-            <w:tcW w:type="dxa" w:w="4340"/>
-            <w:shd w:fill="D9D9D9" w:val="clear"/>
-            <w:tcMar>
-              <w:top w:type="dxa" w:w="40"/>
-              <w:left w:type="dxa" w:w="80"/>
-              <w:bottom w:type="dxa" w:w="40"/>
-              <w:right w:type="dxa" w:w="80"/>
-            </w:tcMar>
-            <w:vAlign w:val="center"/>
-          </w:tcPr>
-          <w:p>
-            <w:pPr>
-              <w:spacing w:after="120" w:before="0"/>
-            </w:pPr>
-            <w:r>
-              <w:rPr>
-                <w:rFonts w:ascii="Arial Narrow" w:cs="Arial Narrow" w:eastAsia="Arial Narrow" w:hAnsi="Arial Narrow"/>
-                <w:b w:val="false"/>
-                <w:bCs w:val="false"/>
-                <w:i w:val="false"/>
-                <w:iCs w:val="false"/>
-                <w:sz w:val="22"/>
-                <w:szCs w:val="22"/>
-              </w:rPr>
-              <w:t xml:space="preserve"/>
-            </w:r>
-          </w:p>
-        </w:tc>
-        <w:tc>
-          <w:tcPr>
-            <w:tcW w:type="dxa" w:w="1500"/>
-            <w:shd w:fill="D9D9D9" w:val="clear"/>
-            <w:tcMar>
-              <w:top w:type="dxa" w:w="40"/>
-              <w:left w:type="dxa" w:w="80"/>
-              <w:bottom w:type="dxa" w:w="40"/>
-              <w:right w:type="dxa" w:w="80"/>
-            </w:tcMar>
-            <w:vAlign w:val="center"/>
-          </w:tcPr>
-          <w:p>
-            <w:pPr>
-              <w:spacing w:after="120" w:before="0"/>
-              <w:jc w:val="center"/>
-            </w:pPr>
-            <w:r>
-              <w:rPr>
-                <w:rFonts w:ascii="Arial Narrow" w:cs="Arial Narrow" w:eastAsia="Arial Narrow" w:hAnsi="Arial Narrow"/>
-                <w:b/>
-                <w:bCs/>
-                <w:i w:val="false"/>
-                <w:iCs w:val="false"/>
-                <w:sz w:val="22"/>
-                <w:szCs w:val="22"/>
-              </w:rPr>
-              <w:t xml:space="preserve">{totalHH}</w:t>
-            </w:r>
-          </w:p>
-        </w:tc>
-      </w:tr>
-    </w:tbl>
+    <w:p>
+      <w:pPr>
+        <w:spacing w:before="0" w:after="0"/>
+      </w:pPr>
+      <w:r>
+        <w:t xml:space="preserve">{tablaHistogramaHH}</w:t>
+      </w:r>
+    </w:p>
     <w:p>
       <w:pPr>
         <w:spacing w:after="0" w:before="0"/>

</xml_diff>

<commit_message>
feat(plan-trabajo): anexos en hoja horizontal con organigrama de formas editables y cronograma Gantt de la linea base
Co-Authored-By: Claude Opus 5.5 <noreply@anthropic.com>
</commit_message>
<xml_diff>
--- a/src/lib/services/planTrabajo/templates/plan-trabajo-nexa-template.docx
+++ b/src/lib/services/planTrabajo/templates/plan-trabajo-nexa-template.docx
@@ -5810,9 +5810,16 @@
       </w:r>
     </w:p>
     <w:p>
-      <w:r>
-        <w:br w:type="page"/>
-      </w:r>
+      <w:pPr>
+        <w:sectPr>
+          <w:headerReference w:type="default" r:id="rId7"/>
+          <w:footerReference w:type="default" r:id="rId8"/>
+          <w:pgSz w:w="11905" w:h="16837" w:orient="portrait"/>
+          <w:pgMar w:top="1020" w:right="1133" w:bottom="1020" w:left="1133" w:header="708" w:footer="708" w:gutter="0"/>
+          <w:pgNumType/>
+          <w:docGrid w:linePitch="360"/>
+        </w:sectPr>
+      </w:pPr>
     </w:p>
     <w:p>
       <w:pPr>
@@ -5834,6 +5841,38 @@
     </w:p>
     <w:p>
       <w:pPr>
+        <w:spacing w:before="0" w:after="0"/>
+      </w:pPr>
+      <w:r>
+        <w:t xml:space="preserve">{#tieneOrganigramaNativo}</w:t>
+      </w:r>
+    </w:p>
+    <w:p>
+      <w:pPr>
+        <w:spacing w:before="0" w:after="0"/>
+      </w:pPr>
+      <w:r>
+        <w:t xml:space="preserve">{organigramaNativo}</w:t>
+      </w:r>
+    </w:p>
+    <w:p>
+      <w:pPr>
+        <w:spacing w:before="0" w:after="0"/>
+      </w:pPr>
+      <w:r>
+        <w:t xml:space="preserve">{/tieneOrganigramaNativo}</w:t>
+      </w:r>
+    </w:p>
+    <w:p>
+      <w:pPr>
+        <w:spacing w:before="0" w:after="0"/>
+      </w:pPr>
+      <w:r>
+        <w:t xml:space="preserve">{^tieneOrganigramaNativo}</w:t>
+      </w:r>
+    </w:p>
+    <w:p>
+      <w:pPr>
         <w:spacing w:after="120" w:before="0"/>
         <w:jc w:val="center"/>
       </w:pPr>
@@ -5848,6 +5887,14 @@
           <w:szCs w:val="22"/>
         </w:rPr>
         <w:t xml:space="preserve">{%organigramaPng}</w:t>
+      </w:r>
+    </w:p>
+    <w:p>
+      <w:pPr>
+        <w:spacing w:before="0" w:after="0"/>
+      </w:pPr>
+      <w:r>
+        <w:t xml:space="preserve">{/tieneOrganigramaNativo}</w:t>
       </w:r>
     </w:p>
     <w:p>
@@ -5875,6 +5922,95 @@
     </w:p>
     <w:p>
       <w:pPr>
+        <w:spacing w:before="0" w:after="0"/>
+      </w:pPr>
+      <w:r>
+        <w:t xml:space="preserve">{#tieneGantt}</w:t>
+      </w:r>
+    </w:p>
+    <w:p>
+      <w:pPr>
+        <w:keepNext/>
+        <w:spacing w:before="120" w:after="120"/>
+      </w:pPr>
+      <w:r>
+        <w:rPr>
+          <w:rFonts w:ascii="Arial Narrow" w:cs="Arial Narrow" w:eastAsia="Arial Narrow" w:hAnsi="Arial Narrow"/>
+          <w:b/>
+          <w:bCs/>
+          <w:sz w:val="22"/>
+          <w:szCs w:val="22"/>
+        </w:rPr>
+        <w:t xml:space="preserve">B.1 Cronograma general (por semanas)</w:t>
+      </w:r>
+    </w:p>
+    <w:p>
+      <w:pPr>
+        <w:spacing w:before="0" w:after="0"/>
+      </w:pPr>
+      <w:r>
+        <w:t xml:space="preserve">{ganttGeneral}</w:t>
+      </w:r>
+    </w:p>
+    <w:p>
+      <w:pPr>
+        <w:spacing w:before="0" w:after="0"/>
+      </w:pPr>
+      <w:r>
+        <w:t xml:space="preserve">{#tieneGanttDetalle}</w:t>
+      </w:r>
+    </w:p>
+    <w:p>
+      <w:pPr>
+        <w:pageBreakBefore/>
+        <w:keepNext/>
+        <w:spacing w:before="120" w:after="120"/>
+      </w:pPr>
+      <w:r>
+        <w:rPr>
+          <w:rFonts w:ascii="Arial Narrow" w:cs="Arial Narrow" w:eastAsia="Arial Narrow" w:hAnsi="Arial Narrow"/>
+          <w:b/>
+          <w:bCs/>
+          <w:sz w:val="22"/>
+          <w:szCs w:val="22"/>
+        </w:rPr>
+        <w:t xml:space="preserve">B.2 Detalle de Construcción y Comisionamiento (por días)</w:t>
+      </w:r>
+    </w:p>
+    <w:p>
+      <w:pPr>
+        <w:spacing w:before="0" w:after="0"/>
+      </w:pPr>
+      <w:r>
+        <w:t xml:space="preserve">{ganttDetalle}</w:t>
+      </w:r>
+    </w:p>
+    <w:p>
+      <w:pPr>
+        <w:spacing w:before="0" w:after="0"/>
+      </w:pPr>
+      <w:r>
+        <w:t xml:space="preserve">{/tieneGanttDetalle}</w:t>
+      </w:r>
+    </w:p>
+    <w:p>
+      <w:pPr>
+        <w:spacing w:before="0" w:after="0"/>
+      </w:pPr>
+      <w:r>
+        <w:t xml:space="preserve">{/tieneGantt}</w:t>
+      </w:r>
+    </w:p>
+    <w:p>
+      <w:pPr>
+        <w:spacing w:before="0" w:after="0"/>
+      </w:pPr>
+      <w:r>
+        <w:t xml:space="preserve">{^tieneGantt}</w:t>
+      </w:r>
+    </w:p>
+    <w:p>
+      <w:pPr>
         <w:spacing w:after="120" w:before="0"/>
         <w:jc w:val="center"/>
       </w:pPr>
@@ -5891,10 +6027,18 @@
         <w:t xml:space="preserve">El cronograma detallado del proyecto se adjunta como documento independiente con la referencia indicada.</w:t>
       </w:r>
     </w:p>
+    <w:p>
+      <w:pPr>
+        <w:spacing w:before="0" w:after="0"/>
+      </w:pPr>
+      <w:r>
+        <w:t xml:space="preserve">{/tieneGantt}</w:t>
+      </w:r>
+    </w:p>
     <w:sectPr>
-      <w:headerReference w:type="default" r:id="rId7"/>
+      <w:headerReference w:type="default" r:id="rIdEncabezadoHorizontal"/>
       <w:footerReference w:type="default" r:id="rId8"/>
-      <w:pgSz w:w="11905" w:h="16837" w:orient="portrait"/>
+      <w:pgSz w:w="16837" w:h="11905" w:orient="landscape"/>
       <w:pgMar w:top="1020" w:right="1133" w:bottom="1020" w:left="1133" w:header="708" w:footer="708" w:gutter="0"/>
       <w:pgNumType/>
       <w:docGrid w:linePitch="360"/>
@@ -6421,6 +6565,422 @@
 </w:hdr>
 </file>
 
+<file path=word/header2.xml><?xml version="1.0" encoding="utf-8"?>
+<w:hdr xmlns:wpc="http://schemas.microsoft.com/office/word/2010/wordprocessingCanvas" xmlns:mc="http://schemas.openxmlformats.org/markup-compatibility/2006" xmlns:o="urn:schemas-microsoft-com:office:office" xmlns:r="http://schemas.openxmlformats.org/officeDocument/2006/relationships" xmlns:m="http://schemas.openxmlformats.org/officeDocument/2006/math" xmlns:v="urn:schemas-microsoft-com:vml" xmlns:wp14="http://schemas.microsoft.com/office/word/2010/wordprocessingDrawing" xmlns:wp="http://schemas.openxmlformats.org/drawingml/2006/wordprocessingDrawing" xmlns:w10="urn:schemas-microsoft-com:office:word" xmlns:w="http://schemas.openxmlformats.org/wordprocessingml/2006/main" xmlns:w14="http://schemas.microsoft.com/office/word/2010/wordml" xmlns:w15="http://schemas.microsoft.com/office/word/2012/wordml" xmlns:wpg="http://schemas.microsoft.com/office/word/2010/wordprocessingGroup" xmlns:wpi="http://schemas.microsoft.com/office/word/2010/wordprocessingInk" xmlns:wne="http://schemas.microsoft.com/office/word/2006/wordml" xmlns:wps="http://schemas.microsoft.com/office/word/2010/wordprocessingShape" xmlns:cx="http://schemas.microsoft.com/office/drawing/2014/chartex" xmlns:cx1="http://schemas.microsoft.com/office/drawing/2015/9/8/chartex" xmlns:cx2="http://schemas.microsoft.com/office/drawing/2015/10/21/chartex" xmlns:cx3="http://schemas.microsoft.com/office/drawing/2016/5/9/chartex" xmlns:cx4="http://schemas.microsoft.com/office/drawing/2016/5/10/chartex" xmlns:cx5="http://schemas.microsoft.com/office/drawing/2016/5/11/chartex" xmlns:cx6="http://schemas.microsoft.com/office/drawing/2016/5/12/chartex" xmlns:cx7="http://schemas.microsoft.com/office/drawing/2016/5/13/chartex" xmlns:cx8="http://schemas.microsoft.com/office/drawing/2016/5/14/chartex" xmlns:w16cid="http://schemas.microsoft.com/office/word/2016/wordml/cid" xmlns:w16se="http://schemas.microsoft.com/office/word/2015/wordml/symex">
+  <w:tbl>
+    <w:tblPr>
+      <w:tblW w:w="14571" w:type="dxa"/>
+      <w:tblBorders>
+        <w:top w:val="single" w:color="auto" w:sz="4"/>
+        <w:left w:val="single" w:color="auto" w:sz="4"/>
+        <w:bottom w:val="single" w:color="auto" w:sz="4"/>
+        <w:right w:val="single" w:color="auto" w:sz="4"/>
+        <w:insideH w:val="single" w:color="auto" w:sz="4"/>
+        <w:insideV w:val="single" w:color="auto" w:sz="4"/>
+      </w:tblBorders>
+      <w:tblLayout w:type="fixed"/>
+    </w:tblPr>
+    <w:tblGrid>
+      <w:gridCol w:w="8034"/>
+      <w:gridCol w:w="5038"/>
+      <w:gridCol w:w="1499"/>
+    </w:tblGrid>
+    <w:tr>
+      <w:tc>
+        <w:tcPr>
+          <w:tcW w:w="8034" w:type="dxa"/>
+          <w:tcMar>
+            <w:top w:w="30" w:type="dxa"/>
+            <w:left w:w="80" w:type="dxa"/>
+            <w:bottom w:w="30" w:type="dxa"/>
+            <w:right w:w="80" w:type="dxa"/>
+          </w:tcMar>
+          <w:vAlign w:val="center"/>
+        </w:tcPr>
+        <w:p>
+          <w:pPr>
+            <w:spacing w:before="60" w:after="60"/>
+            <w:jc w:val="center"/>
+          </w:pPr>
+          <w:r>
+            <w:drawing>
+              <wp:inline distT="0" distB="0" distL="0" distR="0">
+                <wp:extent cx="1000919" cy="247650"/>
+                <wp:effectExtent l="0" t="0" r="0" b="0"/>
+                <wp:docPr id="1" name="nexa_logo.png" descr="Logo Nexa Resources"/>
+                <wp:cNvGraphicFramePr/>
+                <a:graphic xmlns:a="http://schemas.openxmlformats.org/drawingml/2006/main">
+                  <a:graphicData uri="http://schemas.openxmlformats.org/drawingml/2006/picture">
+                    <pic:pic xmlns:pic="http://schemas.openxmlformats.org/drawingml/2006/picture">
+                      <pic:nvPicPr>
+                        <pic:cNvPr id="0" name="nexa_logo.png" descr="Logo Nexa Resources"/>
+                        <pic:cNvPicPr preferRelativeResize="0"/>
+                      </pic:nvPicPr>
+                      <pic:blipFill>
+                        <a:blip r:embed="rId1"/>
+                        <a:srcRect/>
+                        <a:stretch>
+                          <a:fillRect/>
+                        </a:stretch>
+                      </pic:blipFill>
+                      <pic:spPr>
+                        <a:xfrm>
+                          <a:off x="0" y="0"/>
+                          <a:ext cx="1000919" cy="247650"/>
+                        </a:xfrm>
+                        <a:prstGeom prst="rect">
+                          <a:avLst/>
+                        </a:prstGeom>
+                        <a:ln/>
+                      </pic:spPr>
+                    </pic:pic>
+                  </a:graphicData>
+                </a:graphic>
+              </wp:inline>
+            </w:drawing>
+          </w:r>
+        </w:p>
+      </w:tc>
+      <w:tc>
+        <w:tcPr>
+          <w:tcW w:w="6537" w:type="dxa"/>
+          <w:gridSpan w:val="2"/>
+          <w:tcMar>
+            <w:top w:w="30" w:type="dxa"/>
+            <w:left w:w="80" w:type="dxa"/>
+            <w:bottom w:w="30" w:type="dxa"/>
+            <w:right w:w="80" w:type="dxa"/>
+          </w:tcMar>
+          <w:vAlign w:val="center"/>
+        </w:tcPr>
+        <w:p>
+          <w:pPr>
+            <w:spacing w:before="0" w:after="0"/>
+            <w:jc w:val="center"/>
+          </w:pPr>
+          <w:r>
+            <w:rPr>
+              <w:rFonts w:ascii="Arial Narrow" w:cs="Arial Narrow" w:eastAsia="Arial Narrow" w:hAnsi="Arial Narrow"/>
+              <w:b/>
+              <w:bCs/>
+              <w:sz w:val="20"/>
+              <w:szCs w:val="20"/>
+            </w:rPr>
+            <w:t xml:space="preserve">NEXA RESOURCES</w:t>
+          </w:r>
+        </w:p>
+        <w:p>
+          <w:pPr>
+            <w:spacing w:before="0" w:after="0"/>
+            <w:jc w:val="center"/>
+          </w:pPr>
+          <w:r>
+            <w:rPr>
+              <w:rFonts w:ascii="Arial Narrow" w:cs="Arial Narrow" w:eastAsia="Arial Narrow" w:hAnsi="Arial Narrow"/>
+              <w:b/>
+              <w:bCs/>
+              <w:sz w:val="20"/>
+              <w:szCs w:val="20"/>
+            </w:rPr>
+            <w:t xml:space="preserve">REFINERIA CAJAMARQUILLA</w:t>
+          </w:r>
+        </w:p>
+      </w:tc>
+    </w:tr>
+    <w:tr>
+      <w:tc>
+        <w:tcPr>
+          <w:tcW w:w="8034" w:type="dxa"/>
+          <w:vMerge w:val="restart"/>
+          <w:tcMar>
+            <w:top w:w="30" w:type="dxa"/>
+            <w:left w:w="80" w:type="dxa"/>
+            <w:bottom w:w="30" w:type="dxa"/>
+            <w:right w:w="80" w:type="dxa"/>
+          </w:tcMar>
+        </w:tcPr>
+        <w:p>
+          <w:pPr>
+            <w:spacing w:before="0" w:after="0"/>
+          </w:pPr>
+          <w:r>
+            <w:rPr>
+              <w:rFonts w:ascii="Arial Narrow" w:cs="Arial Narrow" w:eastAsia="Arial Narrow" w:hAnsi="Arial Narrow"/>
+              <w:b/>
+              <w:bCs/>
+              <w:sz w:val="20"/>
+              <w:szCs w:val="20"/>
+            </w:rPr>
+            <w:t xml:space="preserve">ORDEN DE COMPRA </w:t>
+          </w:r>
+          <w:r>
+            <w:rPr>
+              <w:rFonts w:ascii="Arial Narrow" w:cs="Arial Narrow" w:eastAsia="Arial Narrow" w:hAnsi="Arial Narrow"/>
+              <w:sz w:val="20"/>
+              <w:szCs w:val="20"/>
+            </w:rPr>
+            <w:t xml:space="preserve">{ordenCompra}</w:t>
+          </w:r>
+        </w:p>
+        <w:p>
+          <w:pPr>
+            <w:spacing w:before="0" w:after="0"/>
+          </w:pPr>
+          <w:r>
+            <w:rPr>
+              <w:rFonts w:ascii="Arial Narrow" w:cs="Arial Narrow" w:eastAsia="Arial Narrow" w:hAnsi="Arial Narrow"/>
+              <w:b/>
+              <w:bCs/>
+              <w:sz w:val="20"/>
+              <w:szCs w:val="20"/>
+            </w:rPr>
+            <w:t xml:space="preserve">NOMBRE DEL PROYECTO </w:t>
+          </w:r>
+          <w:r>
+            <w:rPr>
+              <w:rFonts w:ascii="Arial Narrow" w:cs="Arial Narrow" w:eastAsia="Arial Narrow" w:hAnsi="Arial Narrow"/>
+              <w:sz w:val="20"/>
+              <w:szCs w:val="20"/>
+            </w:rPr>
+            <w:t xml:space="preserve">{nombreProyecto}</w:t>
+          </w:r>
+        </w:p>
+        <w:p>
+          <w:pPr>
+            <w:spacing w:before="0" w:after="0"/>
+          </w:pPr>
+          <w:r>
+            <w:rPr>
+              <w:rFonts w:ascii="Arial Narrow" w:cs="Arial Narrow" w:eastAsia="Arial Narrow" w:hAnsi="Arial Narrow"/>
+              <w:b/>
+              <w:bCs/>
+              <w:sz w:val="20"/>
+              <w:szCs w:val="20"/>
+            </w:rPr>
+            <w:t xml:space="preserve">TIPO DE DOCUMENTO/TÍTULO DEL DOCUMENTO</w:t>
+          </w:r>
+        </w:p>
+        <w:p>
+          <w:pPr>
+            <w:spacing w:before="0" w:after="0"/>
+          </w:pPr>
+          <w:r>
+            <w:rPr>
+              <w:rFonts w:ascii="Arial Narrow" w:cs="Arial Narrow" w:eastAsia="Arial Narrow" w:hAnsi="Arial Narrow"/>
+              <w:sz w:val="20"/>
+              <w:szCs w:val="20"/>
+            </w:rPr>
+            <w:t xml:space="preserve">PLAN DE TRABAJO</w:t>
+          </w:r>
+        </w:p>
+      </w:tc>
+      <w:tc>
+        <w:tcPr>
+          <w:tcW w:w="5038" w:type="dxa"/>
+          <w:tcMar>
+            <w:top w:w="30" w:type="dxa"/>
+            <w:left w:w="80" w:type="dxa"/>
+            <w:bottom w:w="30" w:type="dxa"/>
+            <w:right w:w="80" w:type="dxa"/>
+          </w:tcMar>
+        </w:tcPr>
+        <w:p>
+          <w:pPr>
+            <w:spacing w:before="0" w:after="0"/>
+          </w:pPr>
+          <w:r>
+            <w:rPr>
+              <w:rFonts w:ascii="Arial Narrow" w:cs="Arial Narrow" w:eastAsia="Arial Narrow" w:hAnsi="Arial Narrow"/>
+              <w:b/>
+              <w:bCs/>
+              <w:sz w:val="20"/>
+              <w:szCs w:val="20"/>
+            </w:rPr>
+            <w:t xml:space="preserve">Nº. NEXA:</w:t>
+          </w:r>
+        </w:p>
+        <w:p>
+          <w:pPr>
+            <w:spacing w:before="0" w:after="0"/>
+            <w:jc w:val="center"/>
+          </w:pPr>
+          <w:r>
+            <w:rPr>
+              <w:rFonts w:ascii="Arial Narrow" w:cs="Arial Narrow" w:eastAsia="Arial Narrow" w:hAnsi="Arial Narrow"/>
+              <w:sz w:val="20"/>
+              <w:szCs w:val="20"/>
+            </w:rPr>
+            <w:t xml:space="preserve">{codigoDocumento}</w:t>
+          </w:r>
+        </w:p>
+      </w:tc>
+      <w:tc>
+        <w:tcPr>
+          <w:tcW w:w="1499" w:type="dxa"/>
+          <w:tcMar>
+            <w:top w:w="30" w:type="dxa"/>
+            <w:left w:w="80" w:type="dxa"/>
+            <w:bottom w:w="30" w:type="dxa"/>
+            <w:right w:w="80" w:type="dxa"/>
+          </w:tcMar>
+        </w:tcPr>
+        <w:p>
+          <w:pPr>
+            <w:spacing w:before="0" w:after="0"/>
+            <w:jc w:val="center"/>
+          </w:pPr>
+          <w:r>
+            <w:rPr>
+              <w:rFonts w:ascii="Arial Narrow" w:cs="Arial Narrow" w:eastAsia="Arial Narrow" w:hAnsi="Arial Narrow"/>
+              <w:b/>
+              <w:bCs/>
+              <w:sz w:val="20"/>
+              <w:szCs w:val="20"/>
+            </w:rPr>
+            <w:t xml:space="preserve">HOJA</w:t>
+          </w:r>
+        </w:p>
+        <w:p>
+          <w:pPr>
+            <w:spacing w:before="0" w:after="0"/>
+            <w:jc w:val="center"/>
+          </w:pPr>
+          <w:r>
+            <w:rPr>
+              <w:rFonts w:ascii="Arial Narrow" w:cs="Arial Narrow" w:eastAsia="Arial Narrow" w:hAnsi="Arial Narrow"/>
+              <w:sz w:val="20"/>
+              <w:szCs w:val="20"/>
+            </w:rPr>
+            <w:fldChar w:fldCharType="begin"/>
+            <w:instrText xml:space="preserve">PAGE</w:instrText>
+            <w:fldChar w:fldCharType="separate"/>
+            <w:fldChar w:fldCharType="end"/>
+            <w:t xml:space="preserve">/</w:t>
+            <w:fldChar w:fldCharType="begin"/>
+            <w:instrText xml:space="preserve">NUMPAGES</w:instrText>
+            <w:fldChar w:fldCharType="separate"/>
+            <w:fldChar w:fldCharType="end"/>
+          </w:r>
+        </w:p>
+      </w:tc>
+    </w:tr>
+    <w:tr>
+      <w:tc>
+        <w:tcPr>
+          <w:tcW w:w="8034" w:type="dxa"/>
+          <w:vMerge/>
+          <w:tcMar>
+            <w:top w:w="30" w:type="dxa"/>
+            <w:left w:w="80" w:type="dxa"/>
+            <w:bottom w:w="30" w:type="dxa"/>
+            <w:right w:w="80" w:type="dxa"/>
+          </w:tcMar>
+        </w:tcPr>
+        <w:p/>
+      </w:tc>
+      <w:tc>
+        <w:tcPr>
+          <w:tcW w:w="5038" w:type="dxa"/>
+          <w:tcMar>
+            <w:top w:w="30" w:type="dxa"/>
+            <w:left w:w="80" w:type="dxa"/>
+            <w:bottom w:w="30" w:type="dxa"/>
+            <w:right w:w="80" w:type="dxa"/>
+          </w:tcMar>
+        </w:tcPr>
+        <w:p>
+          <w:pPr>
+            <w:spacing w:before="0" w:after="0"/>
+          </w:pPr>
+          <w:r>
+            <w:rPr>
+              <w:rFonts w:ascii="Arial Narrow" w:cs="Arial Narrow" w:eastAsia="Arial Narrow" w:hAnsi="Arial Narrow"/>
+              <w:b/>
+              <w:bCs/>
+              <w:sz w:val="20"/>
+              <w:szCs w:val="20"/>
+            </w:rPr>
+            <w:t xml:space="preserve">Nº. CONSULTOR:</w:t>
+          </w:r>
+        </w:p>
+        <w:p>
+          <w:pPr>
+            <w:spacing w:before="0" w:after="0"/>
+            <w:jc w:val="center"/>
+          </w:pPr>
+          <w:r>
+            <w:rPr>
+              <w:rFonts w:ascii="Arial Narrow" w:cs="Arial Narrow" w:eastAsia="Arial Narrow" w:hAnsi="Arial Narrow"/>
+              <w:sz w:val="20"/>
+              <w:szCs w:val="20"/>
+            </w:rPr>
+            <w:t xml:space="preserve">{numeroConsultor}</w:t>
+          </w:r>
+        </w:p>
+      </w:tc>
+      <w:tc>
+        <w:tcPr>
+          <w:tcW w:w="1499" w:type="dxa"/>
+          <w:tcMar>
+            <w:top w:w="30" w:type="dxa"/>
+            <w:left w:w="80" w:type="dxa"/>
+            <w:bottom w:w="30" w:type="dxa"/>
+            <w:right w:w="80" w:type="dxa"/>
+          </w:tcMar>
+        </w:tcPr>
+        <w:p>
+          <w:pPr>
+            <w:spacing w:before="0" w:after="0"/>
+            <w:jc w:val="center"/>
+          </w:pPr>
+          <w:r>
+            <w:rPr>
+              <w:rFonts w:ascii="Arial Narrow" w:cs="Arial Narrow" w:eastAsia="Arial Narrow" w:hAnsi="Arial Narrow"/>
+              <w:b/>
+              <w:bCs/>
+              <w:sz w:val="20"/>
+              <w:szCs w:val="20"/>
+            </w:rPr>
+            <w:t xml:space="preserve">REV.</w:t>
+          </w:r>
+        </w:p>
+        <w:p>
+          <w:pPr>
+            <w:spacing w:before="0" w:after="0"/>
+            <w:jc w:val="center"/>
+          </w:pPr>
+          <w:r>
+            <w:rPr>
+              <w:rFonts w:ascii="Arial Narrow" w:cs="Arial Narrow" w:eastAsia="Arial Narrow" w:hAnsi="Arial Narrow"/>
+              <w:sz w:val="20"/>
+              <w:szCs w:val="20"/>
+            </w:rPr>
+            <w:t xml:space="preserve">{revision}</w:t>
+          </w:r>
+        </w:p>
+      </w:tc>
+    </w:tr>
+  </w:tbl>
+  <w:p>
+    <w:pPr>
+      <w:spacing w:after="80" w:before="0"/>
+    </w:pPr>
+    <w:r>
+      <w:rPr>
+        <w:rFonts w:ascii="Arial Narrow" w:cs="Arial Narrow" w:eastAsia="Arial Narrow" w:hAnsi="Arial Narrow"/>
+        <w:b w:val="false"/>
+        <w:bCs w:val="false"/>
+        <w:i w:val="false"/>
+        <w:iCs w:val="false"/>
+        <w:sz w:val="22"/>
+        <w:szCs w:val="22"/>
+      </w:rPr>
+      <w:t xml:space="preserve"/>
+    </w:r>
+  </w:p>
+</w:hdr>
+</file>
+
 <file path=word/numbering.xml><?xml version="1.0" encoding="utf-8"?>
 <w:numbering xmlns:wpc="http://schemas.microsoft.com/office/word/2010/wordprocessingCanvas" xmlns:mc="http://schemas.openxmlformats.org/markup-compatibility/2006" xmlns:o="urn:schemas-microsoft-com:office:office" xmlns:r="http://schemas.openxmlformats.org/officeDocument/2006/relationships" xmlns:m="http://schemas.openxmlformats.org/officeDocument/2006/math" xmlns:v="urn:schemas-microsoft-com:vml" xmlns:wp14="http://schemas.microsoft.com/office/word/2010/wordprocessingDrawing" xmlns:wp="http://schemas.openxmlformats.org/drawingml/2006/wordprocessingDrawing" xmlns:w10="urn:schemas-microsoft-com:office:word" xmlns:w="http://schemas.openxmlformats.org/wordprocessingml/2006/main" xmlns:w14="http://schemas.microsoft.com/office/word/2010/wordml" xmlns:w15="http://schemas.microsoft.com/office/word/2012/wordml" xmlns:wpg="http://schemas.microsoft.com/office/word/2010/wordprocessingGroup" xmlns:wpi="http://schemas.microsoft.com/office/word/2010/wordprocessingInk" xmlns:wne="http://schemas.microsoft.com/office/word/2006/wordml" xmlns:wps="http://schemas.microsoft.com/office/word/2010/wordprocessingShape" mc:Ignorable="w14 w15 wp14">
   <w:abstractNum w:abstractNumId="1" w15:restartNumberingAfterBreak="0">

</xml_diff>